<commit_message>
docs: notas de seguridad
</commit_message>
<xml_diff>
--- a/docs/El-Mejor-Postor-Documentacion.docx
+++ b/docs/El-Mejor-Postor-Documentacion.docx
@@ -6524,7 +6524,7 @@
         <w:t xml:space="preserve">Producción: </w:t>
       </w:r>
       <w:r>
-        <w:t>docker-compose.prod.yml corre en Production sin datos de demostración ni /api/docs y exige SA_PASSWORD, JWT_CLAVE, WEB_URL y SMTP desde .env (plantilla en .env.example). Probado levantándolo aparte.</w:t>
+        <w:t>docker-compose.prod.yml corre en Production sin datos de demostración ni /api/docs y exige SA_PASSWORD, JWT_CLAVE, WEB_URL y SMTP desde .env (plantilla en .env.example). Probado levantándolo aparte. nginx escucha solo en 127.0.0.1 y toma la IP real del cliente del proxy con HTTPS, para que cada persona tenga su propio límite de intentos.</w:t>
       </w:r>
     </w:p>
     <w:p>
@@ -6552,7 +6552,7 @@
         <w:t xml:space="preserve">Correos: </w:t>
       </w:r>
       <w:r>
-        <w:t>la tabla correo_pendiente guarda cada correo hasta entregarlo y reintenta si el SMTP falla, también después de reiniciar la API.</w:t>
+        <w:t>la tabla correo_pendiente guarda cada correo hasta entregarlo y reintenta si el SMTP falla, también después de reiniciar la API. Los correos con un código de recuperación no se guardan: se envían una vez y, si fallan, la persona pide otro enlace.</w:t>
       </w:r>
     </w:p>
     <w:p>

</xml_diff>

<commit_message>
docs: producción y CI
</commit_message>
<xml_diff>
--- a/docs/El-Mejor-Postor-Documentacion.docx
+++ b/docs/El-Mejor-Postor-Documentacion.docx
@@ -2401,7 +2401,7 @@
               <w:rPr>
                 <w:sz w:val="19"/>
               </w:rPr>
-              <w:t>48 pruebas xUnit y 16 pruebas E2E</w:t>
+              <w:t>53 pruebas xUnit y 17 pruebas E2E</w:t>
             </w:r>
           </w:p>
         </w:tc>
@@ -2549,7 +2549,7 @@
       <w:r>
         <w:drawing>
           <wp:inline xmlns:a="http://schemas.openxmlformats.org/drawingml/2006/main" xmlns:pic="http://schemas.openxmlformats.org/drawingml/2006/picture">
-            <wp:extent cx="6188399" cy="2540238"/>
+            <wp:extent cx="6188399" cy="2534107"/>
             <wp:docPr id="1" name="Picture 1"/>
             <wp:cNvGraphicFramePr>
               <a:graphicFrameLocks noChangeAspect="1"/>
@@ -2570,7 +2570,7 @@
                   <pic:spPr>
                     <a:xfrm>
                       <a:off x="0" y="0"/>
-                      <a:ext cx="6188399" cy="2540238"/>
+                      <a:ext cx="6188399" cy="2534107"/>
                     </a:xfrm>
                     <a:prstGeom prst="rect"/>
                   </pic:spPr>
@@ -2960,7 +2960,7 @@
               <w:rPr>
                 <w:sz w:val="19"/>
               </w:rPr>
-              <w:t>48 pruebas xUnit, 16 pruebas Playwright, informe de Playwright</w:t>
+              <w:t>53 pruebas xUnit, 17 pruebas Playwright, integración continua en GitHub Actions</w:t>
             </w:r>
           </w:p>
         </w:tc>
@@ -3758,6 +3758,64 @@
               <w:rPr>
                 <w:sz w:val="19"/>
               </w:rPr>
+              <w:t>e965ccb</w:t>
+            </w:r>
+          </w:p>
+        </w:tc>
+        <w:tc>
+          <w:tcPr>
+            <w:tcW w:type="dxa" w:w="5556"/>
+          </w:tcPr>
+          <w:p>
+            <w:r/>
+            <w:r>
+              <w:rPr>
+                <w:sz w:val="19"/>
+              </w:rPr>
+              <w:t>Corrección de defectos: precio actual, fotos, usuarios desactivados, choques de guardado</w:t>
+            </w:r>
+          </w:p>
+        </w:tc>
+      </w:tr>
+      <w:tr>
+        <w:tc>
+          <w:tcPr>
+            <w:tcW w:type="dxa" w:w="680"/>
+          </w:tcPr>
+          <w:p>
+            <w:r/>
+            <w:r>
+              <w:rPr>
+                <w:sz w:val="19"/>
+              </w:rPr>
+              <w:t>10</w:t>
+            </w:r>
+          </w:p>
+        </w:tc>
+        <w:tc>
+          <w:tcPr>
+            <w:tcW w:type="dxa" w:w="1474"/>
+          </w:tcPr>
+          <w:p>
+            <w:r/>
+            <w:r>
+              <w:rPr>
+                <w:sz w:val="19"/>
+              </w:rPr>
+              <w:t>30-oct-2026</w:t>
+            </w:r>
+          </w:p>
+        </w:tc>
+        <w:tc>
+          <w:tcPr>
+            <w:tcW w:type="dxa" w:w="2041"/>
+          </w:tcPr>
+          <w:p>
+            <w:r/>
+            <w:r>
+              <w:rPr>
+                <w:sz w:val="19"/>
+              </w:rPr>
               <w:t>(este commit)</w:t>
             </w:r>
           </w:p>
@@ -3772,7 +3830,7 @@
               <w:rPr>
                 <w:sz w:val="19"/>
               </w:rPr>
-              <w:t>Corrección de defectos: precio actual, fotos, usuarios desactivados, choques de guardado</w:t>
+              <w:t>Correos persistentes, tope de montos, integración continua, configuración de producción, /api/salud, página de Ayuda</w:t>
             </w:r>
           </w:p>
         </w:tc>
@@ -5579,7 +5637,7 @@
               <w:rPr>
                 <w:sz w:val="19"/>
               </w:rPr>
-              <w:t>48 de 48 aprobadas</w:t>
+              <w:t>53 de 53 aprobadas</w:t>
             </w:r>
           </w:p>
         </w:tc>
@@ -5623,7 +5681,7 @@
               <w:rPr>
                 <w:sz w:val="19"/>
               </w:rPr>
-              <w:t>Crear cuenta, entrar, publicar con foto, editar y retirar, pujar, puja automática, contacto del vendedor, administración, móvil</w:t>
+              <w:t>Crear cuenta, entrar, publicar con foto, editar y retirar, pujar, puja automática, contacto del vendedor, administración, ayuda, móvil</w:t>
             </w:r>
           </w:p>
         </w:tc>
@@ -5637,7 +5695,7 @@
               <w:rPr>
                 <w:sz w:val="19"/>
               </w:rPr>
-              <w:t>16 de 16 aprobadas</w:t>
+              <w:t>17 de 17 aprobadas</w:t>
             </w:r>
           </w:p>
         </w:tc>
@@ -5717,7 +5775,7 @@
     </w:p>
     <w:p>
       <w:r>
-        <w:t>La aplicación funciona de punta a punta. Esta revisión del código encontró defectos y pendientes, ordenados por prioridad. Los defectos 1 a 6 ya se corrigieron, cada uno con su prueba automática.</w:t>
+        <w:t>La aplicación funciona de punta a punta. Esta revisión del código encontró defectos y pendientes, ordenados por prioridad. Todos los defectos ya se corrigieron, cada uno con su prueba automática.</w:t>
       </w:r>
     </w:p>
     <w:p>
@@ -6332,7 +6390,7 @@
               <w:rPr>
                 <w:sz w:val="19"/>
               </w:rPr>
-              <w:t>Pendiente</w:t>
+              <w:t>Corregido</w:t>
             </w:r>
           </w:p>
         </w:tc>
@@ -6404,7 +6462,7 @@
               <w:rPr>
                 <w:sz w:val="19"/>
               </w:rPr>
-              <w:t>Pendiente</w:t>
+              <w:t>Corregido</w:t>
             </w:r>
           </w:p>
         </w:tc>
@@ -6417,6 +6475,14 @@
       </w:pPr>
       <w:r>
         <w:t>8.2 Infraestructura y calidad</w:t>
+      </w:r>
+    </w:p>
+    <w:p>
+      <w:r>
+        <w:rPr>
+          <w:b/>
+        </w:rPr>
+        <w:t>Resuelto:</w:t>
       </w:r>
     </w:p>
     <w:p>
@@ -6430,7 +6496,7 @@
         <w:t xml:space="preserve">Integración continua: </w:t>
       </w:r>
       <w:r>
-        <w:t>no hay .github/workflows. Falta un flujo que corra dotnet test, npm run build y las pruebas E2E en cada pull request.</w:t>
+        <w:t>.github/workflows/ci.yml corre en cada push y pull request las pruebas de la API, la revisión de paquetes vulnerables, la compilación del frontend y las pruebas E2E sobre docker compose.</w:t>
       </w:r>
     </w:p>
     <w:p>
@@ -6444,7 +6510,7 @@
         <w:t xml:space="preserve">Paquete vulnerable: </w:t>
       </w:r>
       <w:r>
-        <w:t>System.Security.Cryptography.Pkcs 9.0.11 (avisos NU1902/NU1903). Hay que fijar una versión corregida.</w:t>
+        <w:t>System.Security.Cryptography.Pkcs fijado en 10.0.14; dotnet list package --vulnerable ya no reporta nada.</w:t>
       </w:r>
     </w:p>
     <w:p>
@@ -6455,10 +6521,10 @@
         <w:rPr>
           <w:b/>
         </w:rPr>
-        <w:t xml:space="preserve">Configuración de producción: </w:t>
+        <w:t xml:space="preserve">Producción: </w:t>
       </w:r>
       <w:r>
-        <w:t>Docker corre en modo Development; faltan appsettings.Production.json, HTTPS, CORS y AllowedHosts reales, y un .env.example.</w:t>
+        <w:t>docker-compose.prod.yml corre en Production sin datos de demostración ni /api/docs y exige SA_PASSWORD, JWT_CLAVE, WEB_URL y SMTP desde .env (plantilla en .env.example). Probado levantándolo aparte.</w:t>
       </w:r>
     </w:p>
     <w:p>
@@ -6469,10 +6535,10 @@
         <w:rPr>
           <w:b/>
         </w:rPr>
-        <w:t xml:space="preserve">Secretos de desarrollo en el repositorio: </w:t>
+        <w:t xml:space="preserve">Salud: </w:t>
       </w:r>
       <w:r>
-        <w:t>la clave JWT de appsettings.Development.json y la contraseña por defecto de SQL Server en docker-compose.yml. Sirven solo para la demostración local.</w:t>
+        <w:t>GET /api/salud comprueba la API y la conexión a SQL Server; el contenedor web tiene healthcheck.</w:t>
       </w:r>
     </w:p>
     <w:p>
@@ -6483,10 +6549,60 @@
         <w:rPr>
           <w:b/>
         </w:rPr>
-        <w:t xml:space="preserve">Salud y registros: </w:t>
+        <w:t xml:space="preserve">Correos: </w:t>
       </w:r>
       <w:r>
-        <w:t>no hay endpoint /health ni healthcheck para api y web; los registros solo van a la consola.</w:t>
+        <w:t>la tabla correo_pendiente guarda cada correo hasta entregarlo y reintenta si el SMTP falla, también después de reiniciar la API.</w:t>
+      </w:r>
+    </w:p>
+    <w:p>
+      <w:pPr>
+        <w:pStyle w:val="ListBullet"/>
+      </w:pPr>
+      <w:r>
+        <w:rPr>
+          <w:b/>
+        </w:rPr>
+        <w:t xml:space="preserve">Repositorio: </w:t>
+      </w:r>
+      <w:r>
+        <w:t>.gitignore en la raíz para .DS_Store y .env.</w:t>
+      </w:r>
+    </w:p>
+    <w:p>
+      <w:r>
+        <w:rPr>
+          <w:b/>
+        </w:rPr>
+        <w:t>Pendiente:</w:t>
+      </w:r>
+    </w:p>
+    <w:p>
+      <w:pPr>
+        <w:pStyle w:val="ListBullet"/>
+      </w:pPr>
+      <w:r>
+        <w:rPr>
+          <w:b/>
+        </w:rPr>
+        <w:t xml:space="preserve">HTTPS: </w:t>
+      </w:r>
+      <w:r>
+        <w:t>lo debe poner un proxy con certificado delante de nginx; el repositorio no incluye certificados.</w:t>
+      </w:r>
+    </w:p>
+    <w:p>
+      <w:pPr>
+        <w:pStyle w:val="ListBullet"/>
+      </w:pPr>
+      <w:r>
+        <w:rPr>
+          <w:b/>
+        </w:rPr>
+        <w:t xml:space="preserve">Secretos de desarrollo: </w:t>
+      </w:r>
+      <w:r>
+        <w:t>la clave JWT de appsettings.Development.json y la contraseña por defecto de docker-compose.yml siguen en el repositorio; solo sirven para la demostración local.</w:t>
       </w:r>
     </w:p>
     <w:p>
@@ -6511,10 +6627,10 @@
         <w:rPr>
           <w:b/>
         </w:rPr>
-        <w:t xml:space="preserve">Repositorio: </w:t>
+        <w:t xml:space="preserve">Licencia: </w:t>
       </w:r>
       <w:r>
-        <w:t>falta un .gitignore en la raíz (para .DS_Store) y una LICENSE.</w:t>
+        <w:t>falta elegir una LICENSE.</w:t>
       </w:r>
     </w:p>
     <w:p>
@@ -6546,15 +6662,7 @@
         <w:pStyle w:val="ListBullet"/>
       </w:pPr>
       <w:r>
-        <w:t>Enlaces vacíos: 9 en el pie de página (incluye «Comisiones»), «Ayuda» en el encabezado simple; «Términos» y «Privacidad» no tienen páginas.</w:t>
-      </w:r>
-    </w:p>
-    <w:p>
-      <w:pPr>
-        <w:pStyle w:val="ListBullet"/>
-      </w:pPr>
-      <w:r>
-        <w:t>La pantalla de crear cuenta promete «guardar favoritos», que no existe.</w:t>
+        <w:t>Resuelto: los enlaces del pie y del encabezado llevan a pantallas reales y a la nueva página de Ayuda (/ayuda), que incluye la sección de datos personales; se quitaron «Comisiones», «Términos» y la promesa de «guardar favoritos».</w:t>
       </w:r>
     </w:p>
     <w:p>

</xml_diff>

<commit_message>
docs: presupuesto por hora
</commit_message>
<xml_diff>
--- a/docs/El-Mejor-Postor-Documentacion.docx
+++ b/docs/El-Mejor-Postor-Documentacion.docx
@@ -2401,7 +2401,7 @@
               <w:rPr>
                 <w:sz w:val="19"/>
               </w:rPr>
-              <w:t>53 pruebas xUnit y 17 pruebas E2E</w:t>
+              <w:t>55 pruebas xUnit y 17 pruebas E2E</w:t>
             </w:r>
           </w:p>
         </w:tc>
@@ -2960,7 +2960,7 @@
               <w:rPr>
                 <w:sz w:val="19"/>
               </w:rPr>
-              <w:t>53 pruebas xUnit, 17 pruebas Playwright, integración continua en GitHub Actions</w:t>
+              <w:t>55 pruebas xUnit, 17 pruebas Playwright, integración continua en GitHub Actions</w:t>
             </w:r>
           </w:p>
         </w:tc>
@@ -5637,7 +5637,7 @@
               <w:rPr>
                 <w:sz w:val="19"/>
               </w:rPr>
-              <w:t>53 de 53 aprobadas</w:t>
+              <w:t>55 de 55 aprobadas</w:t>
             </w:r>
           </w:p>
         </w:tc>
@@ -6663,6 +6663,4878 @@
       </w:pPr>
       <w:r>
         <w:t>Resuelto: los enlaces del pie y del encabezado llevan a pantallas reales y a la nueva página de Ayuda (/ayuda), que incluye la sección de datos personales; se quitaron «Comisiones», «Términos» y la promesa de «guardar favoritos».</w:t>
+      </w:r>
+    </w:p>
+    <w:p>
+      <w:r>
+        <w:br w:type="page"/>
+      </w:r>
+    </w:p>
+    <w:p>
+      <w:pPr>
+        <w:pStyle w:val="Heading1"/>
+      </w:pPr>
+      <w:r>
+        <w:t>9. Presupuesto del proyecto</w:t>
+      </w:r>
+    </w:p>
+    <w:p>
+      <w:r>
+        <w:t>Estimación del costo de construir El Mejor Postor con un equipo contratado, por horas, siguiendo las fases del ciclo de vida (sección 4). Las tarifas son de referencia para el mercado de República Dominicana en 2026 y se pueden ajustar; los totales se recalculan con la misma tabla de horas.</w:t>
+      </w:r>
+    </w:p>
+    <w:p>
+      <w:pPr>
+        <w:pStyle w:val="Heading2"/>
+      </w:pPr>
+      <w:r>
+        <w:t>9.1 Tarifas por hora</w:t>
+      </w:r>
+    </w:p>
+    <w:tbl>
+      <w:tblPr>
+        <w:tblStyle w:val="TableGrid"/>
+        <w:tblW w:type="auto" w:w="0"/>
+        <w:jc w:val="center"/>
+        <w:tblLayout w:type="fixed"/>
+        <w:tblLook w:firstColumn="1" w:firstRow="1" w:lastColumn="0" w:lastRow="0" w:noHBand="0" w:noVBand="1" w:val="04A0"/>
+      </w:tblPr>
+      <w:tblGrid>
+        <w:gridCol w:w="2436"/>
+        <w:gridCol w:w="2436"/>
+        <w:gridCol w:w="2436"/>
+        <w:gridCol w:w="2436"/>
+      </w:tblGrid>
+      <w:tr>
+        <w:trPr>
+          <w:tblHeader w:val="true"/>
+        </w:trPr>
+        <w:tc>
+          <w:tcPr>
+            <w:tcW w:type="dxa" w:w="2381"/>
+            <w:shd w:val="clear" w:color="auto" w:fill="0D4C92"/>
+          </w:tcPr>
+          <w:p>
+            <w:r/>
+            <w:r>
+              <w:rPr>
+                <w:b/>
+                <w:color w:val="FFFFFF"/>
+                <w:sz w:val="20"/>
+              </w:rPr>
+              <w:t>Rol</w:t>
+            </w:r>
+          </w:p>
+        </w:tc>
+        <w:tc>
+          <w:tcPr>
+            <w:tcW w:type="dxa" w:w="3628"/>
+            <w:shd w:val="clear" w:color="auto" w:fill="0D4C92"/>
+          </w:tcPr>
+          <w:p>
+            <w:r/>
+            <w:r>
+              <w:rPr>
+                <w:b/>
+                <w:color w:val="FFFFFF"/>
+                <w:sz w:val="20"/>
+              </w:rPr>
+              <w:t>Responsabilidad</w:t>
+            </w:r>
+          </w:p>
+        </w:tc>
+        <w:tc>
+          <w:tcPr>
+            <w:tcW w:type="dxa" w:w="1871"/>
+            <w:shd w:val="clear" w:color="auto" w:fill="0D4C92"/>
+          </w:tcPr>
+          <w:p>
+            <w:r/>
+            <w:r>
+              <w:rPr>
+                <w:b/>
+                <w:color w:val="FFFFFF"/>
+                <w:sz w:val="20"/>
+              </w:rPr>
+              <w:t>Tarifa por hora</w:t>
+            </w:r>
+          </w:p>
+        </w:tc>
+        <w:tc>
+          <w:tcPr>
+            <w:tcW w:type="dxa" w:w="1871"/>
+            <w:shd w:val="clear" w:color="auto" w:fill="0D4C92"/>
+          </w:tcPr>
+          <w:p>
+            <w:r/>
+            <w:r>
+              <w:rPr>
+                <w:b/>
+                <w:color w:val="FFFFFF"/>
+                <w:sz w:val="20"/>
+              </w:rPr>
+              <w:t>Equivalente</w:t>
+            </w:r>
+          </w:p>
+        </w:tc>
+      </w:tr>
+      <w:tr>
+        <w:tc>
+          <w:tcPr>
+            <w:tcW w:type="dxa" w:w="2381"/>
+          </w:tcPr>
+          <w:p>
+            <w:r/>
+            <w:r>
+              <w:rPr>
+                <w:sz w:val="19"/>
+              </w:rPr>
+              <w:t>Jefe de proyecto</w:t>
+            </w:r>
+          </w:p>
+        </w:tc>
+        <w:tc>
+          <w:tcPr>
+            <w:tcW w:type="dxa" w:w="3628"/>
+          </w:tcPr>
+          <w:p>
+            <w:r/>
+            <w:r>
+              <w:rPr>
+                <w:sz w:val="19"/>
+              </w:rPr>
+              <w:t>Planificación, seguimiento, riesgos y presentación</w:t>
+            </w:r>
+          </w:p>
+        </w:tc>
+        <w:tc>
+          <w:tcPr>
+            <w:tcW w:type="dxa" w:w="1871"/>
+          </w:tcPr>
+          <w:p>
+            <w:r/>
+            <w:r>
+              <w:rPr>
+                <w:sz w:val="19"/>
+              </w:rPr>
+              <w:t>RD$ 1,100.00</w:t>
+            </w:r>
+          </w:p>
+        </w:tc>
+        <w:tc>
+          <w:tcPr>
+            <w:tcW w:type="dxa" w:w="1871"/>
+          </w:tcPr>
+          <w:p>
+            <w:r/>
+            <w:r>
+              <w:rPr>
+                <w:sz w:val="19"/>
+              </w:rPr>
+              <w:t>US$ 17.46</w:t>
+            </w:r>
+          </w:p>
+        </w:tc>
+      </w:tr>
+      <w:tr>
+        <w:tc>
+          <w:tcPr>
+            <w:tcW w:type="dxa" w:w="2381"/>
+          </w:tcPr>
+          <w:p>
+            <w:r/>
+            <w:r>
+              <w:rPr>
+                <w:sz w:val="19"/>
+              </w:rPr>
+              <w:t>Analista de requerimientos</w:t>
+            </w:r>
+          </w:p>
+        </w:tc>
+        <w:tc>
+          <w:tcPr>
+            <w:tcW w:type="dxa" w:w="3628"/>
+          </w:tcPr>
+          <w:p>
+            <w:r/>
+            <w:r>
+              <w:rPr>
+                <w:sz w:val="19"/>
+              </w:rPr>
+              <w:t>Casos de uso, reglas de negocio y documentación</w:t>
+            </w:r>
+          </w:p>
+        </w:tc>
+        <w:tc>
+          <w:tcPr>
+            <w:tcW w:type="dxa" w:w="1871"/>
+          </w:tcPr>
+          <w:p>
+            <w:r/>
+            <w:r>
+              <w:rPr>
+                <w:sz w:val="19"/>
+              </w:rPr>
+              <w:t>RD$ 850.00</w:t>
+            </w:r>
+          </w:p>
+        </w:tc>
+        <w:tc>
+          <w:tcPr>
+            <w:tcW w:type="dxa" w:w="1871"/>
+          </w:tcPr>
+          <w:p>
+            <w:r/>
+            <w:r>
+              <w:rPr>
+                <w:sz w:val="19"/>
+              </w:rPr>
+              <w:t>US$ 13.49</w:t>
+            </w:r>
+          </w:p>
+        </w:tc>
+      </w:tr>
+      <w:tr>
+        <w:tc>
+          <w:tcPr>
+            <w:tcW w:type="dxa" w:w="2381"/>
+          </w:tcPr>
+          <w:p>
+            <w:r/>
+            <w:r>
+              <w:rPr>
+                <w:sz w:val="19"/>
+              </w:rPr>
+              <w:t>Diseñador UX/UI</w:t>
+            </w:r>
+          </w:p>
+        </w:tc>
+        <w:tc>
+          <w:tcPr>
+            <w:tcW w:type="dxa" w:w="3628"/>
+          </w:tcPr>
+          <w:p>
+            <w:r/>
+            <w:r>
+              <w:rPr>
+                <w:sz w:val="19"/>
+              </w:rPr>
+              <w:t>Prototipo en Figma y estilos de la interfaz</w:t>
+            </w:r>
+          </w:p>
+        </w:tc>
+        <w:tc>
+          <w:tcPr>
+            <w:tcW w:type="dxa" w:w="1871"/>
+          </w:tcPr>
+          <w:p>
+            <w:r/>
+            <w:r>
+              <w:rPr>
+                <w:sz w:val="19"/>
+              </w:rPr>
+              <w:t>RD$ 800.00</w:t>
+            </w:r>
+          </w:p>
+        </w:tc>
+        <w:tc>
+          <w:tcPr>
+            <w:tcW w:type="dxa" w:w="1871"/>
+          </w:tcPr>
+          <w:p>
+            <w:r/>
+            <w:r>
+              <w:rPr>
+                <w:sz w:val="19"/>
+              </w:rPr>
+              <w:t>US$ 12.70</w:t>
+            </w:r>
+          </w:p>
+        </w:tc>
+      </w:tr>
+      <w:tr>
+        <w:tc>
+          <w:tcPr>
+            <w:tcW w:type="dxa" w:w="2381"/>
+          </w:tcPr>
+          <w:p>
+            <w:r/>
+            <w:r>
+              <w:rPr>
+                <w:sz w:val="19"/>
+              </w:rPr>
+              <w:t>Desarrollador backend (.NET)</w:t>
+            </w:r>
+          </w:p>
+        </w:tc>
+        <w:tc>
+          <w:tcPr>
+            <w:tcW w:type="dxa" w:w="3628"/>
+          </w:tcPr>
+          <w:p>
+            <w:r/>
+            <w:r>
+              <w:rPr>
+                <w:sz w:val="19"/>
+              </w:rPr>
+              <w:t>API, base de datos, cierre de subastas, correos y tiempo real</w:t>
+            </w:r>
+          </w:p>
+        </w:tc>
+        <w:tc>
+          <w:tcPr>
+            <w:tcW w:type="dxa" w:w="1871"/>
+          </w:tcPr>
+          <w:p>
+            <w:r/>
+            <w:r>
+              <w:rPr>
+                <w:sz w:val="19"/>
+              </w:rPr>
+              <w:t>RD$ 950.00</w:t>
+            </w:r>
+          </w:p>
+        </w:tc>
+        <w:tc>
+          <w:tcPr>
+            <w:tcW w:type="dxa" w:w="1871"/>
+          </w:tcPr>
+          <w:p>
+            <w:r/>
+            <w:r>
+              <w:rPr>
+                <w:sz w:val="19"/>
+              </w:rPr>
+              <w:t>US$ 15.08</w:t>
+            </w:r>
+          </w:p>
+        </w:tc>
+      </w:tr>
+      <w:tr>
+        <w:tc>
+          <w:tcPr>
+            <w:tcW w:type="dxa" w:w="2381"/>
+          </w:tcPr>
+          <w:p>
+            <w:r/>
+            <w:r>
+              <w:rPr>
+                <w:sz w:val="19"/>
+              </w:rPr>
+              <w:t>Desarrollador frontend (Vue)</w:t>
+            </w:r>
+          </w:p>
+        </w:tc>
+        <w:tc>
+          <w:tcPr>
+            <w:tcW w:type="dxa" w:w="3628"/>
+          </w:tcPr>
+          <w:p>
+            <w:r/>
+            <w:r>
+              <w:rPr>
+                <w:sz w:val="19"/>
+              </w:rPr>
+              <w:t>Pantallas, rutas y conexión con la API</w:t>
+            </w:r>
+          </w:p>
+        </w:tc>
+        <w:tc>
+          <w:tcPr>
+            <w:tcW w:type="dxa" w:w="1871"/>
+          </w:tcPr>
+          <w:p>
+            <w:r/>
+            <w:r>
+              <w:rPr>
+                <w:sz w:val="19"/>
+              </w:rPr>
+              <w:t>RD$ 850.00</w:t>
+            </w:r>
+          </w:p>
+        </w:tc>
+        <w:tc>
+          <w:tcPr>
+            <w:tcW w:type="dxa" w:w="1871"/>
+          </w:tcPr>
+          <w:p>
+            <w:r/>
+            <w:r>
+              <w:rPr>
+                <w:sz w:val="19"/>
+              </w:rPr>
+              <w:t>US$ 13.49</w:t>
+            </w:r>
+          </w:p>
+        </w:tc>
+      </w:tr>
+      <w:tr>
+        <w:tc>
+          <w:tcPr>
+            <w:tcW w:type="dxa" w:w="2381"/>
+          </w:tcPr>
+          <w:p>
+            <w:r/>
+            <w:r>
+              <w:rPr>
+                <w:sz w:val="19"/>
+              </w:rPr>
+              <w:t>Tester / QA</w:t>
+            </w:r>
+          </w:p>
+        </w:tc>
+        <w:tc>
+          <w:tcPr>
+            <w:tcW w:type="dxa" w:w="3628"/>
+          </w:tcPr>
+          <w:p>
+            <w:r/>
+            <w:r>
+              <w:rPr>
+                <w:sz w:val="19"/>
+              </w:rPr>
+              <w:t>Pruebas manuales y de punta a punta</w:t>
+            </w:r>
+          </w:p>
+        </w:tc>
+        <w:tc>
+          <w:tcPr>
+            <w:tcW w:type="dxa" w:w="1871"/>
+          </w:tcPr>
+          <w:p>
+            <w:r/>
+            <w:r>
+              <w:rPr>
+                <w:sz w:val="19"/>
+              </w:rPr>
+              <w:t>RD$ 700.00</w:t>
+            </w:r>
+          </w:p>
+        </w:tc>
+        <w:tc>
+          <w:tcPr>
+            <w:tcW w:type="dxa" w:w="1871"/>
+          </w:tcPr>
+          <w:p>
+            <w:r/>
+            <w:r>
+              <w:rPr>
+                <w:sz w:val="19"/>
+              </w:rPr>
+              <w:t>US$ 11.11</w:t>
+            </w:r>
+          </w:p>
+        </w:tc>
+      </w:tr>
+      <w:tr>
+        <w:tc>
+          <w:tcPr>
+            <w:tcW w:type="dxa" w:w="2381"/>
+          </w:tcPr>
+          <w:p>
+            <w:r/>
+            <w:r>
+              <w:rPr>
+                <w:sz w:val="19"/>
+              </w:rPr>
+              <w:t>DevOps</w:t>
+            </w:r>
+          </w:p>
+        </w:tc>
+        <w:tc>
+          <w:tcPr>
+            <w:tcW w:type="dxa" w:w="3628"/>
+          </w:tcPr>
+          <w:p>
+            <w:r/>
+            <w:r>
+              <w:rPr>
+                <w:sz w:val="19"/>
+              </w:rPr>
+              <w:t>Docker, integración continua y puesta en producción</w:t>
+            </w:r>
+          </w:p>
+        </w:tc>
+        <w:tc>
+          <w:tcPr>
+            <w:tcW w:type="dxa" w:w="1871"/>
+          </w:tcPr>
+          <w:p>
+            <w:r/>
+            <w:r>
+              <w:rPr>
+                <w:sz w:val="19"/>
+              </w:rPr>
+              <w:t>RD$ 1,000.00</w:t>
+            </w:r>
+          </w:p>
+        </w:tc>
+        <w:tc>
+          <w:tcPr>
+            <w:tcW w:type="dxa" w:w="1871"/>
+          </w:tcPr>
+          <w:p>
+            <w:r/>
+            <w:r>
+              <w:rPr>
+                <w:sz w:val="19"/>
+              </w:rPr>
+              <w:t>US$ 15.87</w:t>
+            </w:r>
+          </w:p>
+        </w:tc>
+      </w:tr>
+    </w:tbl>
+    <w:p/>
+    <w:p>
+      <w:pPr>
+        <w:pStyle w:val="Heading2"/>
+      </w:pPr>
+      <w:r>
+        <w:t>9.2 Horas y costo por fase</w:t>
+      </w:r>
+    </w:p>
+    <w:tbl>
+      <w:tblPr>
+        <w:tblStyle w:val="TableGrid"/>
+        <w:tblW w:type="auto" w:w="0"/>
+        <w:jc w:val="center"/>
+        <w:tblLayout w:type="fixed"/>
+        <w:tblLook w:firstColumn="1" w:firstRow="1" w:lastColumn="0" w:lastRow="0" w:noHBand="0" w:noVBand="1" w:val="04A0"/>
+      </w:tblPr>
+      <w:tblGrid>
+        <w:gridCol w:w="1949"/>
+        <w:gridCol w:w="1949"/>
+        <w:gridCol w:w="1949"/>
+        <w:gridCol w:w="1949"/>
+        <w:gridCol w:w="1949"/>
+      </w:tblGrid>
+      <w:tr>
+        <w:trPr>
+          <w:tblHeader w:val="true"/>
+        </w:trPr>
+        <w:tc>
+          <w:tcPr>
+            <w:tcW w:type="dxa" w:w="2381"/>
+            <w:shd w:val="clear" w:color="auto" w:fill="0D4C92"/>
+          </w:tcPr>
+          <w:p>
+            <w:r/>
+            <w:r>
+              <w:rPr>
+                <w:b/>
+                <w:color w:val="FFFFFF"/>
+                <w:sz w:val="20"/>
+              </w:rPr>
+              <w:t>Fase</w:t>
+            </w:r>
+          </w:p>
+        </w:tc>
+        <w:tc>
+          <w:tcPr>
+            <w:tcW w:type="dxa" w:w="2721"/>
+            <w:shd w:val="clear" w:color="auto" w:fill="0D4C92"/>
+          </w:tcPr>
+          <w:p>
+            <w:r/>
+            <w:r>
+              <w:rPr>
+                <w:b/>
+                <w:color w:val="FFFFFF"/>
+                <w:sz w:val="20"/>
+              </w:rPr>
+              <w:t>Rol</w:t>
+            </w:r>
+          </w:p>
+        </w:tc>
+        <w:tc>
+          <w:tcPr>
+            <w:tcW w:type="dxa" w:w="907"/>
+            <w:shd w:val="clear" w:color="auto" w:fill="0D4C92"/>
+          </w:tcPr>
+          <w:p>
+            <w:r/>
+            <w:r>
+              <w:rPr>
+                <w:b/>
+                <w:color w:val="FFFFFF"/>
+                <w:sz w:val="20"/>
+              </w:rPr>
+              <w:t>Horas</w:t>
+            </w:r>
+          </w:p>
+        </w:tc>
+        <w:tc>
+          <w:tcPr>
+            <w:tcW w:type="dxa" w:w="1701"/>
+            <w:shd w:val="clear" w:color="auto" w:fill="0D4C92"/>
+          </w:tcPr>
+          <w:p>
+            <w:r/>
+            <w:r>
+              <w:rPr>
+                <w:b/>
+                <w:color w:val="FFFFFF"/>
+                <w:sz w:val="20"/>
+              </w:rPr>
+              <w:t>Tarifa</w:t>
+            </w:r>
+          </w:p>
+        </w:tc>
+        <w:tc>
+          <w:tcPr>
+            <w:tcW w:type="dxa" w:w="2041"/>
+            <w:shd w:val="clear" w:color="auto" w:fill="0D4C92"/>
+          </w:tcPr>
+          <w:p>
+            <w:r/>
+            <w:r>
+              <w:rPr>
+                <w:b/>
+                <w:color w:val="FFFFFF"/>
+                <w:sz w:val="20"/>
+              </w:rPr>
+              <w:t>Subtotal</w:t>
+            </w:r>
+          </w:p>
+        </w:tc>
+      </w:tr>
+      <w:tr>
+        <w:tc>
+          <w:tcPr>
+            <w:tcW w:type="dxa" w:w="2381"/>
+          </w:tcPr>
+          <w:p>
+            <w:r/>
+            <w:r>
+              <w:rPr>
+                <w:sz w:val="19"/>
+              </w:rPr>
+              <w:t>1. Inicio y planificación</w:t>
+            </w:r>
+          </w:p>
+        </w:tc>
+        <w:tc>
+          <w:tcPr>
+            <w:tcW w:type="dxa" w:w="2721"/>
+          </w:tcPr>
+          <w:p>
+            <w:r/>
+            <w:r>
+              <w:rPr>
+                <w:sz w:val="19"/>
+              </w:rPr>
+              <w:t>Jefe de proyecto</w:t>
+            </w:r>
+          </w:p>
+        </w:tc>
+        <w:tc>
+          <w:tcPr>
+            <w:tcW w:type="dxa" w:w="907"/>
+          </w:tcPr>
+          <w:p>
+            <w:r/>
+            <w:r>
+              <w:rPr>
+                <w:sz w:val="19"/>
+              </w:rPr>
+              <w:t>16</w:t>
+            </w:r>
+          </w:p>
+        </w:tc>
+        <w:tc>
+          <w:tcPr>
+            <w:tcW w:type="dxa" w:w="1701"/>
+          </w:tcPr>
+          <w:p>
+            <w:r/>
+            <w:r>
+              <w:rPr>
+                <w:sz w:val="19"/>
+              </w:rPr>
+              <w:t>RD$ 1,100.00</w:t>
+            </w:r>
+          </w:p>
+        </w:tc>
+        <w:tc>
+          <w:tcPr>
+            <w:tcW w:type="dxa" w:w="2041"/>
+          </w:tcPr>
+          <w:p>
+            <w:r/>
+            <w:r>
+              <w:rPr>
+                <w:sz w:val="19"/>
+              </w:rPr>
+              <w:t>RD$ 17,600.00</w:t>
+            </w:r>
+          </w:p>
+        </w:tc>
+      </w:tr>
+      <w:tr>
+        <w:tc>
+          <w:tcPr>
+            <w:tcW w:type="dxa" w:w="2381"/>
+          </w:tcPr>
+          <w:p>
+            <w:r/>
+            <w:r>
+              <w:rPr>
+                <w:sz w:val="19"/>
+              </w:rPr>
+            </w:r>
+          </w:p>
+        </w:tc>
+        <w:tc>
+          <w:tcPr>
+            <w:tcW w:type="dxa" w:w="2721"/>
+          </w:tcPr>
+          <w:p>
+            <w:r/>
+            <w:r>
+              <w:rPr>
+                <w:sz w:val="19"/>
+              </w:rPr>
+              <w:t>Analista de requerimientos</w:t>
+            </w:r>
+          </w:p>
+        </w:tc>
+        <w:tc>
+          <w:tcPr>
+            <w:tcW w:type="dxa" w:w="907"/>
+          </w:tcPr>
+          <w:p>
+            <w:r/>
+            <w:r>
+              <w:rPr>
+                <w:sz w:val="19"/>
+              </w:rPr>
+              <w:t>8</w:t>
+            </w:r>
+          </w:p>
+        </w:tc>
+        <w:tc>
+          <w:tcPr>
+            <w:tcW w:type="dxa" w:w="1701"/>
+          </w:tcPr>
+          <w:p>
+            <w:r/>
+            <w:r>
+              <w:rPr>
+                <w:sz w:val="19"/>
+              </w:rPr>
+              <w:t>RD$ 850.00</w:t>
+            </w:r>
+          </w:p>
+        </w:tc>
+        <w:tc>
+          <w:tcPr>
+            <w:tcW w:type="dxa" w:w="2041"/>
+          </w:tcPr>
+          <w:p>
+            <w:r/>
+            <w:r>
+              <w:rPr>
+                <w:sz w:val="19"/>
+              </w:rPr>
+              <w:t>RD$ 6,800.00</w:t>
+            </w:r>
+          </w:p>
+        </w:tc>
+      </w:tr>
+      <w:tr>
+        <w:tc>
+          <w:tcPr>
+            <w:tcW w:type="dxa" w:w="2381"/>
+            <w:shd w:val="clear" w:color="auto" w:fill="DCE6F2"/>
+          </w:tcPr>
+          <w:p>
+            <w:r>
+              <w:rPr>
+                <w:b/>
+              </w:rPr>
+            </w:r>
+            <w:r>
+              <w:rPr>
+                <w:b/>
+                <w:sz w:val="19"/>
+              </w:rPr>
+            </w:r>
+          </w:p>
+        </w:tc>
+        <w:tc>
+          <w:tcPr>
+            <w:tcW w:type="dxa" w:w="2721"/>
+            <w:shd w:val="clear" w:color="auto" w:fill="DCE6F2"/>
+          </w:tcPr>
+          <w:p>
+            <w:r>
+              <w:rPr>
+                <w:b/>
+              </w:rPr>
+            </w:r>
+            <w:r>
+              <w:rPr>
+                <w:b/>
+                <w:sz w:val="19"/>
+              </w:rPr>
+              <w:t>Subtotal de la fase</w:t>
+            </w:r>
+          </w:p>
+        </w:tc>
+        <w:tc>
+          <w:tcPr>
+            <w:tcW w:type="dxa" w:w="907"/>
+            <w:shd w:val="clear" w:color="auto" w:fill="DCE6F2"/>
+          </w:tcPr>
+          <w:p>
+            <w:r>
+              <w:rPr>
+                <w:b/>
+              </w:rPr>
+            </w:r>
+            <w:r>
+              <w:rPr>
+                <w:b/>
+                <w:sz w:val="19"/>
+              </w:rPr>
+              <w:t>24</w:t>
+            </w:r>
+          </w:p>
+        </w:tc>
+        <w:tc>
+          <w:tcPr>
+            <w:tcW w:type="dxa" w:w="1701"/>
+            <w:shd w:val="clear" w:color="auto" w:fill="DCE6F2"/>
+          </w:tcPr>
+          <w:p>
+            <w:r>
+              <w:rPr>
+                <w:b/>
+              </w:rPr>
+            </w:r>
+            <w:r>
+              <w:rPr>
+                <w:b/>
+                <w:sz w:val="19"/>
+              </w:rPr>
+            </w:r>
+          </w:p>
+        </w:tc>
+        <w:tc>
+          <w:tcPr>
+            <w:tcW w:type="dxa" w:w="2041"/>
+            <w:shd w:val="clear" w:color="auto" w:fill="DCE6F2"/>
+          </w:tcPr>
+          <w:p>
+            <w:r>
+              <w:rPr>
+                <w:b/>
+              </w:rPr>
+            </w:r>
+            <w:r>
+              <w:rPr>
+                <w:b/>
+                <w:sz w:val="19"/>
+              </w:rPr>
+              <w:t>RD$ 24,400.00</w:t>
+            </w:r>
+          </w:p>
+        </w:tc>
+      </w:tr>
+      <w:tr>
+        <w:tc>
+          <w:tcPr>
+            <w:tcW w:type="dxa" w:w="2381"/>
+          </w:tcPr>
+          <w:p>
+            <w:r/>
+            <w:r>
+              <w:rPr>
+                <w:sz w:val="19"/>
+              </w:rPr>
+              <w:t>2. Análisis de requerimientos</w:t>
+            </w:r>
+          </w:p>
+        </w:tc>
+        <w:tc>
+          <w:tcPr>
+            <w:tcW w:type="dxa" w:w="2721"/>
+          </w:tcPr>
+          <w:p>
+            <w:r/>
+            <w:r>
+              <w:rPr>
+                <w:sz w:val="19"/>
+              </w:rPr>
+              <w:t>Analista de requerimientos</w:t>
+            </w:r>
+          </w:p>
+        </w:tc>
+        <w:tc>
+          <w:tcPr>
+            <w:tcW w:type="dxa" w:w="907"/>
+          </w:tcPr>
+          <w:p>
+            <w:r/>
+            <w:r>
+              <w:rPr>
+                <w:sz w:val="19"/>
+              </w:rPr>
+              <w:t>40</w:t>
+            </w:r>
+          </w:p>
+        </w:tc>
+        <w:tc>
+          <w:tcPr>
+            <w:tcW w:type="dxa" w:w="1701"/>
+          </w:tcPr>
+          <w:p>
+            <w:r/>
+            <w:r>
+              <w:rPr>
+                <w:sz w:val="19"/>
+              </w:rPr>
+              <w:t>RD$ 850.00</w:t>
+            </w:r>
+          </w:p>
+        </w:tc>
+        <w:tc>
+          <w:tcPr>
+            <w:tcW w:type="dxa" w:w="2041"/>
+          </w:tcPr>
+          <w:p>
+            <w:r/>
+            <w:r>
+              <w:rPr>
+                <w:sz w:val="19"/>
+              </w:rPr>
+              <w:t>RD$ 34,000.00</w:t>
+            </w:r>
+          </w:p>
+        </w:tc>
+      </w:tr>
+      <w:tr>
+        <w:tc>
+          <w:tcPr>
+            <w:tcW w:type="dxa" w:w="2381"/>
+          </w:tcPr>
+          <w:p>
+            <w:r/>
+            <w:r>
+              <w:rPr>
+                <w:sz w:val="19"/>
+              </w:rPr>
+            </w:r>
+          </w:p>
+        </w:tc>
+        <w:tc>
+          <w:tcPr>
+            <w:tcW w:type="dxa" w:w="2721"/>
+          </w:tcPr>
+          <w:p>
+            <w:r/>
+            <w:r>
+              <w:rPr>
+                <w:sz w:val="19"/>
+              </w:rPr>
+              <w:t>Jefe de proyecto</w:t>
+            </w:r>
+          </w:p>
+        </w:tc>
+        <w:tc>
+          <w:tcPr>
+            <w:tcW w:type="dxa" w:w="907"/>
+          </w:tcPr>
+          <w:p>
+            <w:r/>
+            <w:r>
+              <w:rPr>
+                <w:sz w:val="19"/>
+              </w:rPr>
+              <w:t>8</w:t>
+            </w:r>
+          </w:p>
+        </w:tc>
+        <w:tc>
+          <w:tcPr>
+            <w:tcW w:type="dxa" w:w="1701"/>
+          </w:tcPr>
+          <w:p>
+            <w:r/>
+            <w:r>
+              <w:rPr>
+                <w:sz w:val="19"/>
+              </w:rPr>
+              <w:t>RD$ 1,100.00</w:t>
+            </w:r>
+          </w:p>
+        </w:tc>
+        <w:tc>
+          <w:tcPr>
+            <w:tcW w:type="dxa" w:w="2041"/>
+          </w:tcPr>
+          <w:p>
+            <w:r/>
+            <w:r>
+              <w:rPr>
+                <w:sz w:val="19"/>
+              </w:rPr>
+              <w:t>RD$ 8,800.00</w:t>
+            </w:r>
+          </w:p>
+        </w:tc>
+      </w:tr>
+      <w:tr>
+        <w:tc>
+          <w:tcPr>
+            <w:tcW w:type="dxa" w:w="2381"/>
+            <w:shd w:val="clear" w:color="auto" w:fill="DCE6F2"/>
+          </w:tcPr>
+          <w:p>
+            <w:r>
+              <w:rPr>
+                <w:b/>
+              </w:rPr>
+            </w:r>
+            <w:r>
+              <w:rPr>
+                <w:b/>
+                <w:sz w:val="19"/>
+              </w:rPr>
+            </w:r>
+          </w:p>
+        </w:tc>
+        <w:tc>
+          <w:tcPr>
+            <w:tcW w:type="dxa" w:w="2721"/>
+            <w:shd w:val="clear" w:color="auto" w:fill="DCE6F2"/>
+          </w:tcPr>
+          <w:p>
+            <w:r>
+              <w:rPr>
+                <w:b/>
+              </w:rPr>
+            </w:r>
+            <w:r>
+              <w:rPr>
+                <w:b/>
+                <w:sz w:val="19"/>
+              </w:rPr>
+              <w:t>Subtotal de la fase</w:t>
+            </w:r>
+          </w:p>
+        </w:tc>
+        <w:tc>
+          <w:tcPr>
+            <w:tcW w:type="dxa" w:w="907"/>
+            <w:shd w:val="clear" w:color="auto" w:fill="DCE6F2"/>
+          </w:tcPr>
+          <w:p>
+            <w:r>
+              <w:rPr>
+                <w:b/>
+              </w:rPr>
+            </w:r>
+            <w:r>
+              <w:rPr>
+                <w:b/>
+                <w:sz w:val="19"/>
+              </w:rPr>
+              <w:t>48</w:t>
+            </w:r>
+          </w:p>
+        </w:tc>
+        <w:tc>
+          <w:tcPr>
+            <w:tcW w:type="dxa" w:w="1701"/>
+            <w:shd w:val="clear" w:color="auto" w:fill="DCE6F2"/>
+          </w:tcPr>
+          <w:p>
+            <w:r>
+              <w:rPr>
+                <w:b/>
+              </w:rPr>
+            </w:r>
+            <w:r>
+              <w:rPr>
+                <w:b/>
+                <w:sz w:val="19"/>
+              </w:rPr>
+            </w:r>
+          </w:p>
+        </w:tc>
+        <w:tc>
+          <w:tcPr>
+            <w:tcW w:type="dxa" w:w="2041"/>
+            <w:shd w:val="clear" w:color="auto" w:fill="DCE6F2"/>
+          </w:tcPr>
+          <w:p>
+            <w:r>
+              <w:rPr>
+                <w:b/>
+              </w:rPr>
+            </w:r>
+            <w:r>
+              <w:rPr>
+                <w:b/>
+                <w:sz w:val="19"/>
+              </w:rPr>
+              <w:t>RD$ 42,800.00</w:t>
+            </w:r>
+          </w:p>
+        </w:tc>
+      </w:tr>
+      <w:tr>
+        <w:tc>
+          <w:tcPr>
+            <w:tcW w:type="dxa" w:w="2381"/>
+          </w:tcPr>
+          <w:p>
+            <w:r/>
+            <w:r>
+              <w:rPr>
+                <w:sz w:val="19"/>
+              </w:rPr>
+              <w:t>3. Diseño</w:t>
+            </w:r>
+          </w:p>
+        </w:tc>
+        <w:tc>
+          <w:tcPr>
+            <w:tcW w:type="dxa" w:w="2721"/>
+          </w:tcPr>
+          <w:p>
+            <w:r/>
+            <w:r>
+              <w:rPr>
+                <w:sz w:val="19"/>
+              </w:rPr>
+              <w:t>Diseñador UX/UI</w:t>
+            </w:r>
+          </w:p>
+        </w:tc>
+        <w:tc>
+          <w:tcPr>
+            <w:tcW w:type="dxa" w:w="907"/>
+          </w:tcPr>
+          <w:p>
+            <w:r/>
+            <w:r>
+              <w:rPr>
+                <w:sz w:val="19"/>
+              </w:rPr>
+              <w:t>60</w:t>
+            </w:r>
+          </w:p>
+        </w:tc>
+        <w:tc>
+          <w:tcPr>
+            <w:tcW w:type="dxa" w:w="1701"/>
+          </w:tcPr>
+          <w:p>
+            <w:r/>
+            <w:r>
+              <w:rPr>
+                <w:sz w:val="19"/>
+              </w:rPr>
+              <w:t>RD$ 800.00</w:t>
+            </w:r>
+          </w:p>
+        </w:tc>
+        <w:tc>
+          <w:tcPr>
+            <w:tcW w:type="dxa" w:w="2041"/>
+          </w:tcPr>
+          <w:p>
+            <w:r/>
+            <w:r>
+              <w:rPr>
+                <w:sz w:val="19"/>
+              </w:rPr>
+              <w:t>RD$ 48,000.00</w:t>
+            </w:r>
+          </w:p>
+        </w:tc>
+      </w:tr>
+      <w:tr>
+        <w:tc>
+          <w:tcPr>
+            <w:tcW w:type="dxa" w:w="2381"/>
+          </w:tcPr>
+          <w:p>
+            <w:r/>
+            <w:r>
+              <w:rPr>
+                <w:sz w:val="19"/>
+              </w:rPr>
+            </w:r>
+          </w:p>
+        </w:tc>
+        <w:tc>
+          <w:tcPr>
+            <w:tcW w:type="dxa" w:w="2721"/>
+          </w:tcPr>
+          <w:p>
+            <w:r/>
+            <w:r>
+              <w:rPr>
+                <w:sz w:val="19"/>
+              </w:rPr>
+              <w:t>Analista de requerimientos</w:t>
+            </w:r>
+          </w:p>
+        </w:tc>
+        <w:tc>
+          <w:tcPr>
+            <w:tcW w:type="dxa" w:w="907"/>
+          </w:tcPr>
+          <w:p>
+            <w:r/>
+            <w:r>
+              <w:rPr>
+                <w:sz w:val="19"/>
+              </w:rPr>
+              <w:t>16</w:t>
+            </w:r>
+          </w:p>
+        </w:tc>
+        <w:tc>
+          <w:tcPr>
+            <w:tcW w:type="dxa" w:w="1701"/>
+          </w:tcPr>
+          <w:p>
+            <w:r/>
+            <w:r>
+              <w:rPr>
+                <w:sz w:val="19"/>
+              </w:rPr>
+              <w:t>RD$ 850.00</w:t>
+            </w:r>
+          </w:p>
+        </w:tc>
+        <w:tc>
+          <w:tcPr>
+            <w:tcW w:type="dxa" w:w="2041"/>
+          </w:tcPr>
+          <w:p>
+            <w:r/>
+            <w:r>
+              <w:rPr>
+                <w:sz w:val="19"/>
+              </w:rPr>
+              <w:t>RD$ 13,600.00</w:t>
+            </w:r>
+          </w:p>
+        </w:tc>
+      </w:tr>
+      <w:tr>
+        <w:tc>
+          <w:tcPr>
+            <w:tcW w:type="dxa" w:w="2381"/>
+          </w:tcPr>
+          <w:p>
+            <w:r/>
+            <w:r>
+              <w:rPr>
+                <w:sz w:val="19"/>
+              </w:rPr>
+            </w:r>
+          </w:p>
+        </w:tc>
+        <w:tc>
+          <w:tcPr>
+            <w:tcW w:type="dxa" w:w="2721"/>
+          </w:tcPr>
+          <w:p>
+            <w:r/>
+            <w:r>
+              <w:rPr>
+                <w:sz w:val="19"/>
+              </w:rPr>
+              <w:t>Desarrollador backend (.NET)</w:t>
+            </w:r>
+          </w:p>
+        </w:tc>
+        <w:tc>
+          <w:tcPr>
+            <w:tcW w:type="dxa" w:w="907"/>
+          </w:tcPr>
+          <w:p>
+            <w:r/>
+            <w:r>
+              <w:rPr>
+                <w:sz w:val="19"/>
+              </w:rPr>
+              <w:t>16</w:t>
+            </w:r>
+          </w:p>
+        </w:tc>
+        <w:tc>
+          <w:tcPr>
+            <w:tcW w:type="dxa" w:w="1701"/>
+          </w:tcPr>
+          <w:p>
+            <w:r/>
+            <w:r>
+              <w:rPr>
+                <w:sz w:val="19"/>
+              </w:rPr>
+              <w:t>RD$ 950.00</w:t>
+            </w:r>
+          </w:p>
+        </w:tc>
+        <w:tc>
+          <w:tcPr>
+            <w:tcW w:type="dxa" w:w="2041"/>
+          </w:tcPr>
+          <w:p>
+            <w:r/>
+            <w:r>
+              <w:rPr>
+                <w:sz w:val="19"/>
+              </w:rPr>
+              <w:t>RD$ 15,200.00</w:t>
+            </w:r>
+          </w:p>
+        </w:tc>
+      </w:tr>
+      <w:tr>
+        <w:tc>
+          <w:tcPr>
+            <w:tcW w:type="dxa" w:w="2381"/>
+            <w:shd w:val="clear" w:color="auto" w:fill="DCE6F2"/>
+          </w:tcPr>
+          <w:p>
+            <w:r>
+              <w:rPr>
+                <w:b/>
+              </w:rPr>
+            </w:r>
+            <w:r>
+              <w:rPr>
+                <w:b/>
+                <w:sz w:val="19"/>
+              </w:rPr>
+            </w:r>
+          </w:p>
+        </w:tc>
+        <w:tc>
+          <w:tcPr>
+            <w:tcW w:type="dxa" w:w="2721"/>
+            <w:shd w:val="clear" w:color="auto" w:fill="DCE6F2"/>
+          </w:tcPr>
+          <w:p>
+            <w:r>
+              <w:rPr>
+                <w:b/>
+              </w:rPr>
+            </w:r>
+            <w:r>
+              <w:rPr>
+                <w:b/>
+                <w:sz w:val="19"/>
+              </w:rPr>
+              <w:t>Subtotal de la fase</w:t>
+            </w:r>
+          </w:p>
+        </w:tc>
+        <w:tc>
+          <w:tcPr>
+            <w:tcW w:type="dxa" w:w="907"/>
+            <w:shd w:val="clear" w:color="auto" w:fill="DCE6F2"/>
+          </w:tcPr>
+          <w:p>
+            <w:r>
+              <w:rPr>
+                <w:b/>
+              </w:rPr>
+            </w:r>
+            <w:r>
+              <w:rPr>
+                <w:b/>
+                <w:sz w:val="19"/>
+              </w:rPr>
+              <w:t>92</w:t>
+            </w:r>
+          </w:p>
+        </w:tc>
+        <w:tc>
+          <w:tcPr>
+            <w:tcW w:type="dxa" w:w="1701"/>
+            <w:shd w:val="clear" w:color="auto" w:fill="DCE6F2"/>
+          </w:tcPr>
+          <w:p>
+            <w:r>
+              <w:rPr>
+                <w:b/>
+              </w:rPr>
+            </w:r>
+            <w:r>
+              <w:rPr>
+                <w:b/>
+                <w:sz w:val="19"/>
+              </w:rPr>
+            </w:r>
+          </w:p>
+        </w:tc>
+        <w:tc>
+          <w:tcPr>
+            <w:tcW w:type="dxa" w:w="2041"/>
+            <w:shd w:val="clear" w:color="auto" w:fill="DCE6F2"/>
+          </w:tcPr>
+          <w:p>
+            <w:r>
+              <w:rPr>
+                <w:b/>
+              </w:rPr>
+            </w:r>
+            <w:r>
+              <w:rPr>
+                <w:b/>
+                <w:sz w:val="19"/>
+              </w:rPr>
+              <w:t>RD$ 76,800.00</w:t>
+            </w:r>
+          </w:p>
+        </w:tc>
+      </w:tr>
+      <w:tr>
+        <w:tc>
+          <w:tcPr>
+            <w:tcW w:type="dxa" w:w="2381"/>
+          </w:tcPr>
+          <w:p>
+            <w:r/>
+            <w:r>
+              <w:rPr>
+                <w:sz w:val="19"/>
+              </w:rPr>
+              <w:t>4. Implementación</w:t>
+            </w:r>
+          </w:p>
+        </w:tc>
+        <w:tc>
+          <w:tcPr>
+            <w:tcW w:type="dxa" w:w="2721"/>
+          </w:tcPr>
+          <w:p>
+            <w:r/>
+            <w:r>
+              <w:rPr>
+                <w:sz w:val="19"/>
+              </w:rPr>
+              <w:t>Desarrollador backend (.NET)</w:t>
+            </w:r>
+          </w:p>
+        </w:tc>
+        <w:tc>
+          <w:tcPr>
+            <w:tcW w:type="dxa" w:w="907"/>
+          </w:tcPr>
+          <w:p>
+            <w:r/>
+            <w:r>
+              <w:rPr>
+                <w:sz w:val="19"/>
+              </w:rPr>
+              <w:t>160</w:t>
+            </w:r>
+          </w:p>
+        </w:tc>
+        <w:tc>
+          <w:tcPr>
+            <w:tcW w:type="dxa" w:w="1701"/>
+          </w:tcPr>
+          <w:p>
+            <w:r/>
+            <w:r>
+              <w:rPr>
+                <w:sz w:val="19"/>
+              </w:rPr>
+              <w:t>RD$ 950.00</w:t>
+            </w:r>
+          </w:p>
+        </w:tc>
+        <w:tc>
+          <w:tcPr>
+            <w:tcW w:type="dxa" w:w="2041"/>
+          </w:tcPr>
+          <w:p>
+            <w:r/>
+            <w:r>
+              <w:rPr>
+                <w:sz w:val="19"/>
+              </w:rPr>
+              <w:t>RD$ 152,000.00</w:t>
+            </w:r>
+          </w:p>
+        </w:tc>
+      </w:tr>
+      <w:tr>
+        <w:tc>
+          <w:tcPr>
+            <w:tcW w:type="dxa" w:w="2381"/>
+          </w:tcPr>
+          <w:p>
+            <w:r/>
+            <w:r>
+              <w:rPr>
+                <w:sz w:val="19"/>
+              </w:rPr>
+            </w:r>
+          </w:p>
+        </w:tc>
+        <w:tc>
+          <w:tcPr>
+            <w:tcW w:type="dxa" w:w="2721"/>
+          </w:tcPr>
+          <w:p>
+            <w:r/>
+            <w:r>
+              <w:rPr>
+                <w:sz w:val="19"/>
+              </w:rPr>
+              <w:t>Desarrollador frontend (Vue)</w:t>
+            </w:r>
+          </w:p>
+        </w:tc>
+        <w:tc>
+          <w:tcPr>
+            <w:tcW w:type="dxa" w:w="907"/>
+          </w:tcPr>
+          <w:p>
+            <w:r/>
+            <w:r>
+              <w:rPr>
+                <w:sz w:val="19"/>
+              </w:rPr>
+              <w:t>140</w:t>
+            </w:r>
+          </w:p>
+        </w:tc>
+        <w:tc>
+          <w:tcPr>
+            <w:tcW w:type="dxa" w:w="1701"/>
+          </w:tcPr>
+          <w:p>
+            <w:r/>
+            <w:r>
+              <w:rPr>
+                <w:sz w:val="19"/>
+              </w:rPr>
+              <w:t>RD$ 850.00</w:t>
+            </w:r>
+          </w:p>
+        </w:tc>
+        <w:tc>
+          <w:tcPr>
+            <w:tcW w:type="dxa" w:w="2041"/>
+          </w:tcPr>
+          <w:p>
+            <w:r/>
+            <w:r>
+              <w:rPr>
+                <w:sz w:val="19"/>
+              </w:rPr>
+              <w:t>RD$ 119,000.00</w:t>
+            </w:r>
+          </w:p>
+        </w:tc>
+      </w:tr>
+      <w:tr>
+        <w:tc>
+          <w:tcPr>
+            <w:tcW w:type="dxa" w:w="2381"/>
+          </w:tcPr>
+          <w:p>
+            <w:r/>
+            <w:r>
+              <w:rPr>
+                <w:sz w:val="19"/>
+              </w:rPr>
+            </w:r>
+          </w:p>
+        </w:tc>
+        <w:tc>
+          <w:tcPr>
+            <w:tcW w:type="dxa" w:w="2721"/>
+          </w:tcPr>
+          <w:p>
+            <w:r/>
+            <w:r>
+              <w:rPr>
+                <w:sz w:val="19"/>
+              </w:rPr>
+              <w:t>Diseñador UX/UI</w:t>
+            </w:r>
+          </w:p>
+        </w:tc>
+        <w:tc>
+          <w:tcPr>
+            <w:tcW w:type="dxa" w:w="907"/>
+          </w:tcPr>
+          <w:p>
+            <w:r/>
+            <w:r>
+              <w:rPr>
+                <w:sz w:val="19"/>
+              </w:rPr>
+              <w:t>10</w:t>
+            </w:r>
+          </w:p>
+        </w:tc>
+        <w:tc>
+          <w:tcPr>
+            <w:tcW w:type="dxa" w:w="1701"/>
+          </w:tcPr>
+          <w:p>
+            <w:r/>
+            <w:r>
+              <w:rPr>
+                <w:sz w:val="19"/>
+              </w:rPr>
+              <w:t>RD$ 800.00</w:t>
+            </w:r>
+          </w:p>
+        </w:tc>
+        <w:tc>
+          <w:tcPr>
+            <w:tcW w:type="dxa" w:w="2041"/>
+          </w:tcPr>
+          <w:p>
+            <w:r/>
+            <w:r>
+              <w:rPr>
+                <w:sz w:val="19"/>
+              </w:rPr>
+              <w:t>RD$ 8,000.00</w:t>
+            </w:r>
+          </w:p>
+        </w:tc>
+      </w:tr>
+      <w:tr>
+        <w:tc>
+          <w:tcPr>
+            <w:tcW w:type="dxa" w:w="2381"/>
+          </w:tcPr>
+          <w:p>
+            <w:r/>
+            <w:r>
+              <w:rPr>
+                <w:sz w:val="19"/>
+              </w:rPr>
+            </w:r>
+          </w:p>
+        </w:tc>
+        <w:tc>
+          <w:tcPr>
+            <w:tcW w:type="dxa" w:w="2721"/>
+          </w:tcPr>
+          <w:p>
+            <w:r/>
+            <w:r>
+              <w:rPr>
+                <w:sz w:val="19"/>
+              </w:rPr>
+              <w:t>Jefe de proyecto</w:t>
+            </w:r>
+          </w:p>
+        </w:tc>
+        <w:tc>
+          <w:tcPr>
+            <w:tcW w:type="dxa" w:w="907"/>
+          </w:tcPr>
+          <w:p>
+            <w:r/>
+            <w:r>
+              <w:rPr>
+                <w:sz w:val="19"/>
+              </w:rPr>
+              <w:t>20</w:t>
+            </w:r>
+          </w:p>
+        </w:tc>
+        <w:tc>
+          <w:tcPr>
+            <w:tcW w:type="dxa" w:w="1701"/>
+          </w:tcPr>
+          <w:p>
+            <w:r/>
+            <w:r>
+              <w:rPr>
+                <w:sz w:val="19"/>
+              </w:rPr>
+              <w:t>RD$ 1,100.00</w:t>
+            </w:r>
+          </w:p>
+        </w:tc>
+        <w:tc>
+          <w:tcPr>
+            <w:tcW w:type="dxa" w:w="2041"/>
+          </w:tcPr>
+          <w:p>
+            <w:r/>
+            <w:r>
+              <w:rPr>
+                <w:sz w:val="19"/>
+              </w:rPr>
+              <w:t>RD$ 22,000.00</w:t>
+            </w:r>
+          </w:p>
+        </w:tc>
+      </w:tr>
+      <w:tr>
+        <w:tc>
+          <w:tcPr>
+            <w:tcW w:type="dxa" w:w="2381"/>
+            <w:shd w:val="clear" w:color="auto" w:fill="DCE6F2"/>
+          </w:tcPr>
+          <w:p>
+            <w:r>
+              <w:rPr>
+                <w:b/>
+              </w:rPr>
+            </w:r>
+            <w:r>
+              <w:rPr>
+                <w:b/>
+                <w:sz w:val="19"/>
+              </w:rPr>
+            </w:r>
+          </w:p>
+        </w:tc>
+        <w:tc>
+          <w:tcPr>
+            <w:tcW w:type="dxa" w:w="2721"/>
+            <w:shd w:val="clear" w:color="auto" w:fill="DCE6F2"/>
+          </w:tcPr>
+          <w:p>
+            <w:r>
+              <w:rPr>
+                <w:b/>
+              </w:rPr>
+            </w:r>
+            <w:r>
+              <w:rPr>
+                <w:b/>
+                <w:sz w:val="19"/>
+              </w:rPr>
+              <w:t>Subtotal de la fase</w:t>
+            </w:r>
+          </w:p>
+        </w:tc>
+        <w:tc>
+          <w:tcPr>
+            <w:tcW w:type="dxa" w:w="907"/>
+            <w:shd w:val="clear" w:color="auto" w:fill="DCE6F2"/>
+          </w:tcPr>
+          <w:p>
+            <w:r>
+              <w:rPr>
+                <w:b/>
+              </w:rPr>
+            </w:r>
+            <w:r>
+              <w:rPr>
+                <w:b/>
+                <w:sz w:val="19"/>
+              </w:rPr>
+              <w:t>330</w:t>
+            </w:r>
+          </w:p>
+        </w:tc>
+        <w:tc>
+          <w:tcPr>
+            <w:tcW w:type="dxa" w:w="1701"/>
+            <w:shd w:val="clear" w:color="auto" w:fill="DCE6F2"/>
+          </w:tcPr>
+          <w:p>
+            <w:r>
+              <w:rPr>
+                <w:b/>
+              </w:rPr>
+            </w:r>
+            <w:r>
+              <w:rPr>
+                <w:b/>
+                <w:sz w:val="19"/>
+              </w:rPr>
+            </w:r>
+          </w:p>
+        </w:tc>
+        <w:tc>
+          <w:tcPr>
+            <w:tcW w:type="dxa" w:w="2041"/>
+            <w:shd w:val="clear" w:color="auto" w:fill="DCE6F2"/>
+          </w:tcPr>
+          <w:p>
+            <w:r>
+              <w:rPr>
+                <w:b/>
+              </w:rPr>
+            </w:r>
+            <w:r>
+              <w:rPr>
+                <w:b/>
+                <w:sz w:val="19"/>
+              </w:rPr>
+              <w:t>RD$ 301,000.00</w:t>
+            </w:r>
+          </w:p>
+        </w:tc>
+      </w:tr>
+      <w:tr>
+        <w:tc>
+          <w:tcPr>
+            <w:tcW w:type="dxa" w:w="2381"/>
+          </w:tcPr>
+          <w:p>
+            <w:r/>
+            <w:r>
+              <w:rPr>
+                <w:sz w:val="19"/>
+              </w:rPr>
+              <w:t>5. Pruebas</w:t>
+            </w:r>
+          </w:p>
+        </w:tc>
+        <w:tc>
+          <w:tcPr>
+            <w:tcW w:type="dxa" w:w="2721"/>
+          </w:tcPr>
+          <w:p>
+            <w:r/>
+            <w:r>
+              <w:rPr>
+                <w:sz w:val="19"/>
+              </w:rPr>
+              <w:t>Tester / QA</w:t>
+            </w:r>
+          </w:p>
+        </w:tc>
+        <w:tc>
+          <w:tcPr>
+            <w:tcW w:type="dxa" w:w="907"/>
+          </w:tcPr>
+          <w:p>
+            <w:r/>
+            <w:r>
+              <w:rPr>
+                <w:sz w:val="19"/>
+              </w:rPr>
+              <w:t>70</w:t>
+            </w:r>
+          </w:p>
+        </w:tc>
+        <w:tc>
+          <w:tcPr>
+            <w:tcW w:type="dxa" w:w="1701"/>
+          </w:tcPr>
+          <w:p>
+            <w:r/>
+            <w:r>
+              <w:rPr>
+                <w:sz w:val="19"/>
+              </w:rPr>
+              <w:t>RD$ 700.00</w:t>
+            </w:r>
+          </w:p>
+        </w:tc>
+        <w:tc>
+          <w:tcPr>
+            <w:tcW w:type="dxa" w:w="2041"/>
+          </w:tcPr>
+          <w:p>
+            <w:r/>
+            <w:r>
+              <w:rPr>
+                <w:sz w:val="19"/>
+              </w:rPr>
+              <w:t>RD$ 49,000.00</w:t>
+            </w:r>
+          </w:p>
+        </w:tc>
+      </w:tr>
+      <w:tr>
+        <w:tc>
+          <w:tcPr>
+            <w:tcW w:type="dxa" w:w="2381"/>
+          </w:tcPr>
+          <w:p>
+            <w:r/>
+            <w:r>
+              <w:rPr>
+                <w:sz w:val="19"/>
+              </w:rPr>
+            </w:r>
+          </w:p>
+        </w:tc>
+        <w:tc>
+          <w:tcPr>
+            <w:tcW w:type="dxa" w:w="2721"/>
+          </w:tcPr>
+          <w:p>
+            <w:r/>
+            <w:r>
+              <w:rPr>
+                <w:sz w:val="19"/>
+              </w:rPr>
+              <w:t>Desarrollador backend (.NET)</w:t>
+            </w:r>
+          </w:p>
+        </w:tc>
+        <w:tc>
+          <w:tcPr>
+            <w:tcW w:type="dxa" w:w="907"/>
+          </w:tcPr>
+          <w:p>
+            <w:r/>
+            <w:r>
+              <w:rPr>
+                <w:sz w:val="19"/>
+              </w:rPr>
+              <w:t>20</w:t>
+            </w:r>
+          </w:p>
+        </w:tc>
+        <w:tc>
+          <w:tcPr>
+            <w:tcW w:type="dxa" w:w="1701"/>
+          </w:tcPr>
+          <w:p>
+            <w:r/>
+            <w:r>
+              <w:rPr>
+                <w:sz w:val="19"/>
+              </w:rPr>
+              <w:t>RD$ 950.00</w:t>
+            </w:r>
+          </w:p>
+        </w:tc>
+        <w:tc>
+          <w:tcPr>
+            <w:tcW w:type="dxa" w:w="2041"/>
+          </w:tcPr>
+          <w:p>
+            <w:r/>
+            <w:r>
+              <w:rPr>
+                <w:sz w:val="19"/>
+              </w:rPr>
+              <w:t>RD$ 19,000.00</w:t>
+            </w:r>
+          </w:p>
+        </w:tc>
+      </w:tr>
+      <w:tr>
+        <w:tc>
+          <w:tcPr>
+            <w:tcW w:type="dxa" w:w="2381"/>
+          </w:tcPr>
+          <w:p>
+            <w:r/>
+            <w:r>
+              <w:rPr>
+                <w:sz w:val="19"/>
+              </w:rPr>
+            </w:r>
+          </w:p>
+        </w:tc>
+        <w:tc>
+          <w:tcPr>
+            <w:tcW w:type="dxa" w:w="2721"/>
+          </w:tcPr>
+          <w:p>
+            <w:r/>
+            <w:r>
+              <w:rPr>
+                <w:sz w:val="19"/>
+              </w:rPr>
+              <w:t>Desarrollador frontend (Vue)</w:t>
+            </w:r>
+          </w:p>
+        </w:tc>
+        <w:tc>
+          <w:tcPr>
+            <w:tcW w:type="dxa" w:w="907"/>
+          </w:tcPr>
+          <w:p>
+            <w:r/>
+            <w:r>
+              <w:rPr>
+                <w:sz w:val="19"/>
+              </w:rPr>
+              <w:t>10</w:t>
+            </w:r>
+          </w:p>
+        </w:tc>
+        <w:tc>
+          <w:tcPr>
+            <w:tcW w:type="dxa" w:w="1701"/>
+          </w:tcPr>
+          <w:p>
+            <w:r/>
+            <w:r>
+              <w:rPr>
+                <w:sz w:val="19"/>
+              </w:rPr>
+              <w:t>RD$ 850.00</w:t>
+            </w:r>
+          </w:p>
+        </w:tc>
+        <w:tc>
+          <w:tcPr>
+            <w:tcW w:type="dxa" w:w="2041"/>
+          </w:tcPr>
+          <w:p>
+            <w:r/>
+            <w:r>
+              <w:rPr>
+                <w:sz w:val="19"/>
+              </w:rPr>
+              <w:t>RD$ 8,500.00</w:t>
+            </w:r>
+          </w:p>
+        </w:tc>
+      </w:tr>
+      <w:tr>
+        <w:tc>
+          <w:tcPr>
+            <w:tcW w:type="dxa" w:w="2381"/>
+            <w:shd w:val="clear" w:color="auto" w:fill="DCE6F2"/>
+          </w:tcPr>
+          <w:p>
+            <w:r>
+              <w:rPr>
+                <w:b/>
+              </w:rPr>
+            </w:r>
+            <w:r>
+              <w:rPr>
+                <w:b/>
+                <w:sz w:val="19"/>
+              </w:rPr>
+            </w:r>
+          </w:p>
+        </w:tc>
+        <w:tc>
+          <w:tcPr>
+            <w:tcW w:type="dxa" w:w="2721"/>
+            <w:shd w:val="clear" w:color="auto" w:fill="DCE6F2"/>
+          </w:tcPr>
+          <w:p>
+            <w:r>
+              <w:rPr>
+                <w:b/>
+              </w:rPr>
+            </w:r>
+            <w:r>
+              <w:rPr>
+                <w:b/>
+                <w:sz w:val="19"/>
+              </w:rPr>
+              <w:t>Subtotal de la fase</w:t>
+            </w:r>
+          </w:p>
+        </w:tc>
+        <w:tc>
+          <w:tcPr>
+            <w:tcW w:type="dxa" w:w="907"/>
+            <w:shd w:val="clear" w:color="auto" w:fill="DCE6F2"/>
+          </w:tcPr>
+          <w:p>
+            <w:r>
+              <w:rPr>
+                <w:b/>
+              </w:rPr>
+            </w:r>
+            <w:r>
+              <w:rPr>
+                <w:b/>
+                <w:sz w:val="19"/>
+              </w:rPr>
+              <w:t>100</w:t>
+            </w:r>
+          </w:p>
+        </w:tc>
+        <w:tc>
+          <w:tcPr>
+            <w:tcW w:type="dxa" w:w="1701"/>
+            <w:shd w:val="clear" w:color="auto" w:fill="DCE6F2"/>
+          </w:tcPr>
+          <w:p>
+            <w:r>
+              <w:rPr>
+                <w:b/>
+              </w:rPr>
+            </w:r>
+            <w:r>
+              <w:rPr>
+                <w:b/>
+                <w:sz w:val="19"/>
+              </w:rPr>
+            </w:r>
+          </w:p>
+        </w:tc>
+        <w:tc>
+          <w:tcPr>
+            <w:tcW w:type="dxa" w:w="2041"/>
+            <w:shd w:val="clear" w:color="auto" w:fill="DCE6F2"/>
+          </w:tcPr>
+          <w:p>
+            <w:r>
+              <w:rPr>
+                <w:b/>
+              </w:rPr>
+            </w:r>
+            <w:r>
+              <w:rPr>
+                <w:b/>
+                <w:sz w:val="19"/>
+              </w:rPr>
+              <w:t>RD$ 76,500.00</w:t>
+            </w:r>
+          </w:p>
+        </w:tc>
+      </w:tr>
+      <w:tr>
+        <w:tc>
+          <w:tcPr>
+            <w:tcW w:type="dxa" w:w="2381"/>
+          </w:tcPr>
+          <w:p>
+            <w:r/>
+            <w:r>
+              <w:rPr>
+                <w:sz w:val="19"/>
+              </w:rPr>
+              <w:t>6. Despliegue</w:t>
+            </w:r>
+          </w:p>
+        </w:tc>
+        <w:tc>
+          <w:tcPr>
+            <w:tcW w:type="dxa" w:w="2721"/>
+          </w:tcPr>
+          <w:p>
+            <w:r/>
+            <w:r>
+              <w:rPr>
+                <w:sz w:val="19"/>
+              </w:rPr>
+              <w:t>DevOps</w:t>
+            </w:r>
+          </w:p>
+        </w:tc>
+        <w:tc>
+          <w:tcPr>
+            <w:tcW w:type="dxa" w:w="907"/>
+          </w:tcPr>
+          <w:p>
+            <w:r/>
+            <w:r>
+              <w:rPr>
+                <w:sz w:val="19"/>
+              </w:rPr>
+              <w:t>24</w:t>
+            </w:r>
+          </w:p>
+        </w:tc>
+        <w:tc>
+          <w:tcPr>
+            <w:tcW w:type="dxa" w:w="1701"/>
+          </w:tcPr>
+          <w:p>
+            <w:r/>
+            <w:r>
+              <w:rPr>
+                <w:sz w:val="19"/>
+              </w:rPr>
+              <w:t>RD$ 1,000.00</w:t>
+            </w:r>
+          </w:p>
+        </w:tc>
+        <w:tc>
+          <w:tcPr>
+            <w:tcW w:type="dxa" w:w="2041"/>
+          </w:tcPr>
+          <w:p>
+            <w:r/>
+            <w:r>
+              <w:rPr>
+                <w:sz w:val="19"/>
+              </w:rPr>
+              <w:t>RD$ 24,000.00</w:t>
+            </w:r>
+          </w:p>
+        </w:tc>
+      </w:tr>
+      <w:tr>
+        <w:tc>
+          <w:tcPr>
+            <w:tcW w:type="dxa" w:w="2381"/>
+          </w:tcPr>
+          <w:p>
+            <w:r/>
+            <w:r>
+              <w:rPr>
+                <w:sz w:val="19"/>
+              </w:rPr>
+            </w:r>
+          </w:p>
+        </w:tc>
+        <w:tc>
+          <w:tcPr>
+            <w:tcW w:type="dxa" w:w="2721"/>
+          </w:tcPr>
+          <w:p>
+            <w:r/>
+            <w:r>
+              <w:rPr>
+                <w:sz w:val="19"/>
+              </w:rPr>
+              <w:t>Desarrollador backend (.NET)</w:t>
+            </w:r>
+          </w:p>
+        </w:tc>
+        <w:tc>
+          <w:tcPr>
+            <w:tcW w:type="dxa" w:w="907"/>
+          </w:tcPr>
+          <w:p>
+            <w:r/>
+            <w:r>
+              <w:rPr>
+                <w:sz w:val="19"/>
+              </w:rPr>
+              <w:t>6</w:t>
+            </w:r>
+          </w:p>
+        </w:tc>
+        <w:tc>
+          <w:tcPr>
+            <w:tcW w:type="dxa" w:w="1701"/>
+          </w:tcPr>
+          <w:p>
+            <w:r/>
+            <w:r>
+              <w:rPr>
+                <w:sz w:val="19"/>
+              </w:rPr>
+              <w:t>RD$ 950.00</w:t>
+            </w:r>
+          </w:p>
+        </w:tc>
+        <w:tc>
+          <w:tcPr>
+            <w:tcW w:type="dxa" w:w="2041"/>
+          </w:tcPr>
+          <w:p>
+            <w:r/>
+            <w:r>
+              <w:rPr>
+                <w:sz w:val="19"/>
+              </w:rPr>
+              <w:t>RD$ 5,700.00</w:t>
+            </w:r>
+          </w:p>
+        </w:tc>
+      </w:tr>
+      <w:tr>
+        <w:tc>
+          <w:tcPr>
+            <w:tcW w:type="dxa" w:w="2381"/>
+            <w:shd w:val="clear" w:color="auto" w:fill="DCE6F2"/>
+          </w:tcPr>
+          <w:p>
+            <w:r>
+              <w:rPr>
+                <w:b/>
+              </w:rPr>
+            </w:r>
+            <w:r>
+              <w:rPr>
+                <w:b/>
+                <w:sz w:val="19"/>
+              </w:rPr>
+            </w:r>
+          </w:p>
+        </w:tc>
+        <w:tc>
+          <w:tcPr>
+            <w:tcW w:type="dxa" w:w="2721"/>
+            <w:shd w:val="clear" w:color="auto" w:fill="DCE6F2"/>
+          </w:tcPr>
+          <w:p>
+            <w:r>
+              <w:rPr>
+                <w:b/>
+              </w:rPr>
+            </w:r>
+            <w:r>
+              <w:rPr>
+                <w:b/>
+                <w:sz w:val="19"/>
+              </w:rPr>
+              <w:t>Subtotal de la fase</w:t>
+            </w:r>
+          </w:p>
+        </w:tc>
+        <w:tc>
+          <w:tcPr>
+            <w:tcW w:type="dxa" w:w="907"/>
+            <w:shd w:val="clear" w:color="auto" w:fill="DCE6F2"/>
+          </w:tcPr>
+          <w:p>
+            <w:r>
+              <w:rPr>
+                <w:b/>
+              </w:rPr>
+            </w:r>
+            <w:r>
+              <w:rPr>
+                <w:b/>
+                <w:sz w:val="19"/>
+              </w:rPr>
+              <w:t>30</w:t>
+            </w:r>
+          </w:p>
+        </w:tc>
+        <w:tc>
+          <w:tcPr>
+            <w:tcW w:type="dxa" w:w="1701"/>
+            <w:shd w:val="clear" w:color="auto" w:fill="DCE6F2"/>
+          </w:tcPr>
+          <w:p>
+            <w:r>
+              <w:rPr>
+                <w:b/>
+              </w:rPr>
+            </w:r>
+            <w:r>
+              <w:rPr>
+                <w:b/>
+                <w:sz w:val="19"/>
+              </w:rPr>
+            </w:r>
+          </w:p>
+        </w:tc>
+        <w:tc>
+          <w:tcPr>
+            <w:tcW w:type="dxa" w:w="2041"/>
+            <w:shd w:val="clear" w:color="auto" w:fill="DCE6F2"/>
+          </w:tcPr>
+          <w:p>
+            <w:r>
+              <w:rPr>
+                <w:b/>
+              </w:rPr>
+            </w:r>
+            <w:r>
+              <w:rPr>
+                <w:b/>
+                <w:sz w:val="19"/>
+              </w:rPr>
+              <w:t>RD$ 29,700.00</w:t>
+            </w:r>
+          </w:p>
+        </w:tc>
+      </w:tr>
+      <w:tr>
+        <w:tc>
+          <w:tcPr>
+            <w:tcW w:type="dxa" w:w="2381"/>
+          </w:tcPr>
+          <w:p>
+            <w:r/>
+            <w:r>
+              <w:rPr>
+                <w:sz w:val="19"/>
+              </w:rPr>
+              <w:t>7. Mantenimiento y cierre</w:t>
+            </w:r>
+          </w:p>
+        </w:tc>
+        <w:tc>
+          <w:tcPr>
+            <w:tcW w:type="dxa" w:w="2721"/>
+          </w:tcPr>
+          <w:p>
+            <w:r/>
+            <w:r>
+              <w:rPr>
+                <w:sz w:val="19"/>
+              </w:rPr>
+              <w:t>Desarrollador backend (.NET)</w:t>
+            </w:r>
+          </w:p>
+        </w:tc>
+        <w:tc>
+          <w:tcPr>
+            <w:tcW w:type="dxa" w:w="907"/>
+          </w:tcPr>
+          <w:p>
+            <w:r/>
+            <w:r>
+              <w:rPr>
+                <w:sz w:val="19"/>
+              </w:rPr>
+              <w:t>20</w:t>
+            </w:r>
+          </w:p>
+        </w:tc>
+        <w:tc>
+          <w:tcPr>
+            <w:tcW w:type="dxa" w:w="1701"/>
+          </w:tcPr>
+          <w:p>
+            <w:r/>
+            <w:r>
+              <w:rPr>
+                <w:sz w:val="19"/>
+              </w:rPr>
+              <w:t>RD$ 950.00</w:t>
+            </w:r>
+          </w:p>
+        </w:tc>
+        <w:tc>
+          <w:tcPr>
+            <w:tcW w:type="dxa" w:w="2041"/>
+          </w:tcPr>
+          <w:p>
+            <w:r/>
+            <w:r>
+              <w:rPr>
+                <w:sz w:val="19"/>
+              </w:rPr>
+              <w:t>RD$ 19,000.00</w:t>
+            </w:r>
+          </w:p>
+        </w:tc>
+      </w:tr>
+      <w:tr>
+        <w:tc>
+          <w:tcPr>
+            <w:tcW w:type="dxa" w:w="2381"/>
+          </w:tcPr>
+          <w:p>
+            <w:r/>
+            <w:r>
+              <w:rPr>
+                <w:sz w:val="19"/>
+              </w:rPr>
+            </w:r>
+          </w:p>
+        </w:tc>
+        <w:tc>
+          <w:tcPr>
+            <w:tcW w:type="dxa" w:w="2721"/>
+          </w:tcPr>
+          <w:p>
+            <w:r/>
+            <w:r>
+              <w:rPr>
+                <w:sz w:val="19"/>
+              </w:rPr>
+              <w:t>Desarrollador frontend (Vue)</w:t>
+            </w:r>
+          </w:p>
+        </w:tc>
+        <w:tc>
+          <w:tcPr>
+            <w:tcW w:type="dxa" w:w="907"/>
+          </w:tcPr>
+          <w:p>
+            <w:r/>
+            <w:r>
+              <w:rPr>
+                <w:sz w:val="19"/>
+              </w:rPr>
+              <w:t>10</w:t>
+            </w:r>
+          </w:p>
+        </w:tc>
+        <w:tc>
+          <w:tcPr>
+            <w:tcW w:type="dxa" w:w="1701"/>
+          </w:tcPr>
+          <w:p>
+            <w:r/>
+            <w:r>
+              <w:rPr>
+                <w:sz w:val="19"/>
+              </w:rPr>
+              <w:t>RD$ 850.00</w:t>
+            </w:r>
+          </w:p>
+        </w:tc>
+        <w:tc>
+          <w:tcPr>
+            <w:tcW w:type="dxa" w:w="2041"/>
+          </w:tcPr>
+          <w:p>
+            <w:r/>
+            <w:r>
+              <w:rPr>
+                <w:sz w:val="19"/>
+              </w:rPr>
+              <w:t>RD$ 8,500.00</w:t>
+            </w:r>
+          </w:p>
+        </w:tc>
+      </w:tr>
+      <w:tr>
+        <w:tc>
+          <w:tcPr>
+            <w:tcW w:type="dxa" w:w="2381"/>
+          </w:tcPr>
+          <w:p>
+            <w:r/>
+            <w:r>
+              <w:rPr>
+                <w:sz w:val="19"/>
+              </w:rPr>
+            </w:r>
+          </w:p>
+        </w:tc>
+        <w:tc>
+          <w:tcPr>
+            <w:tcW w:type="dxa" w:w="2721"/>
+          </w:tcPr>
+          <w:p>
+            <w:r/>
+            <w:r>
+              <w:rPr>
+                <w:sz w:val="19"/>
+              </w:rPr>
+              <w:t>Analista de requerimientos</w:t>
+            </w:r>
+          </w:p>
+        </w:tc>
+        <w:tc>
+          <w:tcPr>
+            <w:tcW w:type="dxa" w:w="907"/>
+          </w:tcPr>
+          <w:p>
+            <w:r/>
+            <w:r>
+              <w:rPr>
+                <w:sz w:val="19"/>
+              </w:rPr>
+              <w:t>12</w:t>
+            </w:r>
+          </w:p>
+        </w:tc>
+        <w:tc>
+          <w:tcPr>
+            <w:tcW w:type="dxa" w:w="1701"/>
+          </w:tcPr>
+          <w:p>
+            <w:r/>
+            <w:r>
+              <w:rPr>
+                <w:sz w:val="19"/>
+              </w:rPr>
+              <w:t>RD$ 850.00</w:t>
+            </w:r>
+          </w:p>
+        </w:tc>
+        <w:tc>
+          <w:tcPr>
+            <w:tcW w:type="dxa" w:w="2041"/>
+          </w:tcPr>
+          <w:p>
+            <w:r/>
+            <w:r>
+              <w:rPr>
+                <w:sz w:val="19"/>
+              </w:rPr>
+              <w:t>RD$ 10,200.00</w:t>
+            </w:r>
+          </w:p>
+        </w:tc>
+      </w:tr>
+      <w:tr>
+        <w:tc>
+          <w:tcPr>
+            <w:tcW w:type="dxa" w:w="2381"/>
+          </w:tcPr>
+          <w:p>
+            <w:r/>
+            <w:r>
+              <w:rPr>
+                <w:sz w:val="19"/>
+              </w:rPr>
+            </w:r>
+          </w:p>
+        </w:tc>
+        <w:tc>
+          <w:tcPr>
+            <w:tcW w:type="dxa" w:w="2721"/>
+          </w:tcPr>
+          <w:p>
+            <w:r/>
+            <w:r>
+              <w:rPr>
+                <w:sz w:val="19"/>
+              </w:rPr>
+              <w:t>Jefe de proyecto</w:t>
+            </w:r>
+          </w:p>
+        </w:tc>
+        <w:tc>
+          <w:tcPr>
+            <w:tcW w:type="dxa" w:w="907"/>
+          </w:tcPr>
+          <w:p>
+            <w:r/>
+            <w:r>
+              <w:rPr>
+                <w:sz w:val="19"/>
+              </w:rPr>
+              <w:t>16</w:t>
+            </w:r>
+          </w:p>
+        </w:tc>
+        <w:tc>
+          <w:tcPr>
+            <w:tcW w:type="dxa" w:w="1701"/>
+          </w:tcPr>
+          <w:p>
+            <w:r/>
+            <w:r>
+              <w:rPr>
+                <w:sz w:val="19"/>
+              </w:rPr>
+              <w:t>RD$ 1,100.00</w:t>
+            </w:r>
+          </w:p>
+        </w:tc>
+        <w:tc>
+          <w:tcPr>
+            <w:tcW w:type="dxa" w:w="2041"/>
+          </w:tcPr>
+          <w:p>
+            <w:r/>
+            <w:r>
+              <w:rPr>
+                <w:sz w:val="19"/>
+              </w:rPr>
+              <w:t>RD$ 17,600.00</w:t>
+            </w:r>
+          </w:p>
+        </w:tc>
+      </w:tr>
+      <w:tr>
+        <w:tc>
+          <w:tcPr>
+            <w:tcW w:type="dxa" w:w="2381"/>
+            <w:shd w:val="clear" w:color="auto" w:fill="DCE6F2"/>
+          </w:tcPr>
+          <w:p>
+            <w:r>
+              <w:rPr>
+                <w:b/>
+              </w:rPr>
+            </w:r>
+            <w:r>
+              <w:rPr>
+                <w:b/>
+                <w:sz w:val="19"/>
+              </w:rPr>
+            </w:r>
+          </w:p>
+        </w:tc>
+        <w:tc>
+          <w:tcPr>
+            <w:tcW w:type="dxa" w:w="2721"/>
+            <w:shd w:val="clear" w:color="auto" w:fill="DCE6F2"/>
+          </w:tcPr>
+          <w:p>
+            <w:r>
+              <w:rPr>
+                <w:b/>
+              </w:rPr>
+            </w:r>
+            <w:r>
+              <w:rPr>
+                <w:b/>
+                <w:sz w:val="19"/>
+              </w:rPr>
+              <w:t>Subtotal de la fase</w:t>
+            </w:r>
+          </w:p>
+        </w:tc>
+        <w:tc>
+          <w:tcPr>
+            <w:tcW w:type="dxa" w:w="907"/>
+            <w:shd w:val="clear" w:color="auto" w:fill="DCE6F2"/>
+          </w:tcPr>
+          <w:p>
+            <w:r>
+              <w:rPr>
+                <w:b/>
+              </w:rPr>
+            </w:r>
+            <w:r>
+              <w:rPr>
+                <w:b/>
+                <w:sz w:val="19"/>
+              </w:rPr>
+              <w:t>58</w:t>
+            </w:r>
+          </w:p>
+        </w:tc>
+        <w:tc>
+          <w:tcPr>
+            <w:tcW w:type="dxa" w:w="1701"/>
+            <w:shd w:val="clear" w:color="auto" w:fill="DCE6F2"/>
+          </w:tcPr>
+          <w:p>
+            <w:r>
+              <w:rPr>
+                <w:b/>
+              </w:rPr>
+            </w:r>
+            <w:r>
+              <w:rPr>
+                <w:b/>
+                <w:sz w:val="19"/>
+              </w:rPr>
+            </w:r>
+          </w:p>
+        </w:tc>
+        <w:tc>
+          <w:tcPr>
+            <w:tcW w:type="dxa" w:w="2041"/>
+            <w:shd w:val="clear" w:color="auto" w:fill="DCE6F2"/>
+          </w:tcPr>
+          <w:p>
+            <w:r>
+              <w:rPr>
+                <w:b/>
+              </w:rPr>
+            </w:r>
+            <w:r>
+              <w:rPr>
+                <w:b/>
+                <w:sz w:val="19"/>
+              </w:rPr>
+              <w:t>RD$ 55,300.00</w:t>
+            </w:r>
+          </w:p>
+        </w:tc>
+      </w:tr>
+      <w:tr>
+        <w:tc>
+          <w:tcPr>
+            <w:tcW w:type="dxa" w:w="2381"/>
+            <w:shd w:val="clear" w:color="auto" w:fill="DCE6F2"/>
+          </w:tcPr>
+          <w:p>
+            <w:r>
+              <w:rPr>
+                <w:b/>
+              </w:rPr>
+            </w:r>
+            <w:r>
+              <w:rPr>
+                <w:b/>
+                <w:sz w:val="19"/>
+              </w:rPr>
+              <w:t>TOTAL MANO DE OBRA</w:t>
+            </w:r>
+          </w:p>
+        </w:tc>
+        <w:tc>
+          <w:tcPr>
+            <w:tcW w:type="dxa" w:w="2721"/>
+            <w:shd w:val="clear" w:color="auto" w:fill="DCE6F2"/>
+          </w:tcPr>
+          <w:p>
+            <w:r>
+              <w:rPr>
+                <w:b/>
+              </w:rPr>
+            </w:r>
+            <w:r>
+              <w:rPr>
+                <w:b/>
+                <w:sz w:val="19"/>
+              </w:rPr>
+            </w:r>
+          </w:p>
+        </w:tc>
+        <w:tc>
+          <w:tcPr>
+            <w:tcW w:type="dxa" w:w="907"/>
+            <w:shd w:val="clear" w:color="auto" w:fill="DCE6F2"/>
+          </w:tcPr>
+          <w:p>
+            <w:r>
+              <w:rPr>
+                <w:b/>
+              </w:rPr>
+            </w:r>
+            <w:r>
+              <w:rPr>
+                <w:b/>
+                <w:sz w:val="19"/>
+              </w:rPr>
+              <w:t>682</w:t>
+            </w:r>
+          </w:p>
+        </w:tc>
+        <w:tc>
+          <w:tcPr>
+            <w:tcW w:type="dxa" w:w="1701"/>
+            <w:shd w:val="clear" w:color="auto" w:fill="DCE6F2"/>
+          </w:tcPr>
+          <w:p>
+            <w:r>
+              <w:rPr>
+                <w:b/>
+              </w:rPr>
+            </w:r>
+            <w:r>
+              <w:rPr>
+                <w:b/>
+                <w:sz w:val="19"/>
+              </w:rPr>
+            </w:r>
+          </w:p>
+        </w:tc>
+        <w:tc>
+          <w:tcPr>
+            <w:tcW w:type="dxa" w:w="2041"/>
+            <w:shd w:val="clear" w:color="auto" w:fill="DCE6F2"/>
+          </w:tcPr>
+          <w:p>
+            <w:r>
+              <w:rPr>
+                <w:b/>
+              </w:rPr>
+            </w:r>
+            <w:r>
+              <w:rPr>
+                <w:b/>
+                <w:sz w:val="19"/>
+              </w:rPr>
+              <w:t>RD$ 606,500.00</w:t>
+            </w:r>
+          </w:p>
+        </w:tc>
+      </w:tr>
+    </w:tbl>
+    <w:p/>
+    <w:p>
+      <w:pPr>
+        <w:pStyle w:val="Heading2"/>
+      </w:pPr>
+      <w:r>
+        <w:t>9.3 Resumen por rol</w:t>
+      </w:r>
+    </w:p>
+    <w:tbl>
+      <w:tblPr>
+        <w:tblStyle w:val="TableGrid"/>
+        <w:tblW w:type="auto" w:w="0"/>
+        <w:jc w:val="center"/>
+        <w:tblLayout w:type="fixed"/>
+        <w:tblLook w:firstColumn="1" w:firstRow="1" w:lastColumn="0" w:lastRow="0" w:noHBand="0" w:noVBand="1" w:val="04A0"/>
+      </w:tblPr>
+      <w:tblGrid>
+        <w:gridCol w:w="1949"/>
+        <w:gridCol w:w="1949"/>
+        <w:gridCol w:w="1949"/>
+        <w:gridCol w:w="1949"/>
+        <w:gridCol w:w="1949"/>
+      </w:tblGrid>
+      <w:tr>
+        <w:trPr>
+          <w:tblHeader w:val="true"/>
+        </w:trPr>
+        <w:tc>
+          <w:tcPr>
+            <w:tcW w:type="dxa" w:w="2835"/>
+            <w:shd w:val="clear" w:color="auto" w:fill="0D4C92"/>
+          </w:tcPr>
+          <w:p>
+            <w:r/>
+            <w:r>
+              <w:rPr>
+                <w:b/>
+                <w:color w:val="FFFFFF"/>
+                <w:sz w:val="20"/>
+              </w:rPr>
+              <w:t>Rol</w:t>
+            </w:r>
+          </w:p>
+        </w:tc>
+        <w:tc>
+          <w:tcPr>
+            <w:tcW w:type="dxa" w:w="1020"/>
+            <w:shd w:val="clear" w:color="auto" w:fill="0D4C92"/>
+          </w:tcPr>
+          <w:p>
+            <w:r/>
+            <w:r>
+              <w:rPr>
+                <w:b/>
+                <w:color w:val="FFFFFF"/>
+                <w:sz w:val="20"/>
+              </w:rPr>
+              <w:t>Horas</w:t>
+            </w:r>
+          </w:p>
+        </w:tc>
+        <w:tc>
+          <w:tcPr>
+            <w:tcW w:type="dxa" w:w="1814"/>
+            <w:shd w:val="clear" w:color="auto" w:fill="0D4C92"/>
+          </w:tcPr>
+          <w:p>
+            <w:r/>
+            <w:r>
+              <w:rPr>
+                <w:b/>
+                <w:color w:val="FFFFFF"/>
+                <w:sz w:val="20"/>
+              </w:rPr>
+              <w:t>Tarifa</w:t>
+            </w:r>
+          </w:p>
+        </w:tc>
+        <w:tc>
+          <w:tcPr>
+            <w:tcW w:type="dxa" w:w="2154"/>
+            <w:shd w:val="clear" w:color="auto" w:fill="0D4C92"/>
+          </w:tcPr>
+          <w:p>
+            <w:r/>
+            <w:r>
+              <w:rPr>
+                <w:b/>
+                <w:color w:val="FFFFFF"/>
+                <w:sz w:val="20"/>
+              </w:rPr>
+              <w:t>Costo</w:t>
+            </w:r>
+          </w:p>
+        </w:tc>
+        <w:tc>
+          <w:tcPr>
+            <w:tcW w:type="dxa" w:w="1361"/>
+            <w:shd w:val="clear" w:color="auto" w:fill="0D4C92"/>
+          </w:tcPr>
+          <w:p>
+            <w:r/>
+            <w:r>
+              <w:rPr>
+                <w:b/>
+                <w:color w:val="FFFFFF"/>
+                <w:sz w:val="20"/>
+              </w:rPr>
+              <w:t>% del total</w:t>
+            </w:r>
+          </w:p>
+        </w:tc>
+      </w:tr>
+      <w:tr>
+        <w:tc>
+          <w:tcPr>
+            <w:tcW w:type="dxa" w:w="2835"/>
+          </w:tcPr>
+          <w:p>
+            <w:r/>
+            <w:r>
+              <w:rPr>
+                <w:sz w:val="19"/>
+              </w:rPr>
+              <w:t>Jefe de proyecto</w:t>
+            </w:r>
+          </w:p>
+        </w:tc>
+        <w:tc>
+          <w:tcPr>
+            <w:tcW w:type="dxa" w:w="1020"/>
+          </w:tcPr>
+          <w:p>
+            <w:r/>
+            <w:r>
+              <w:rPr>
+                <w:sz w:val="19"/>
+              </w:rPr>
+              <w:t>60</w:t>
+            </w:r>
+          </w:p>
+        </w:tc>
+        <w:tc>
+          <w:tcPr>
+            <w:tcW w:type="dxa" w:w="1814"/>
+          </w:tcPr>
+          <w:p>
+            <w:r/>
+            <w:r>
+              <w:rPr>
+                <w:sz w:val="19"/>
+              </w:rPr>
+              <w:t>RD$ 1,100.00</w:t>
+            </w:r>
+          </w:p>
+        </w:tc>
+        <w:tc>
+          <w:tcPr>
+            <w:tcW w:type="dxa" w:w="2154"/>
+          </w:tcPr>
+          <w:p>
+            <w:r/>
+            <w:r>
+              <w:rPr>
+                <w:sz w:val="19"/>
+              </w:rPr>
+              <w:t>RD$ 66,000.00</w:t>
+            </w:r>
+          </w:p>
+        </w:tc>
+        <w:tc>
+          <w:tcPr>
+            <w:tcW w:type="dxa" w:w="1361"/>
+          </w:tcPr>
+          <w:p>
+            <w:r/>
+            <w:r>
+              <w:rPr>
+                <w:sz w:val="19"/>
+              </w:rPr>
+              <w:t>10.9%</w:t>
+            </w:r>
+          </w:p>
+        </w:tc>
+      </w:tr>
+      <w:tr>
+        <w:tc>
+          <w:tcPr>
+            <w:tcW w:type="dxa" w:w="2835"/>
+          </w:tcPr>
+          <w:p>
+            <w:r/>
+            <w:r>
+              <w:rPr>
+                <w:sz w:val="19"/>
+              </w:rPr>
+              <w:t>Analista de requerimientos</w:t>
+            </w:r>
+          </w:p>
+        </w:tc>
+        <w:tc>
+          <w:tcPr>
+            <w:tcW w:type="dxa" w:w="1020"/>
+          </w:tcPr>
+          <w:p>
+            <w:r/>
+            <w:r>
+              <w:rPr>
+                <w:sz w:val="19"/>
+              </w:rPr>
+              <w:t>76</w:t>
+            </w:r>
+          </w:p>
+        </w:tc>
+        <w:tc>
+          <w:tcPr>
+            <w:tcW w:type="dxa" w:w="1814"/>
+          </w:tcPr>
+          <w:p>
+            <w:r/>
+            <w:r>
+              <w:rPr>
+                <w:sz w:val="19"/>
+              </w:rPr>
+              <w:t>RD$ 850.00</w:t>
+            </w:r>
+          </w:p>
+        </w:tc>
+        <w:tc>
+          <w:tcPr>
+            <w:tcW w:type="dxa" w:w="2154"/>
+          </w:tcPr>
+          <w:p>
+            <w:r/>
+            <w:r>
+              <w:rPr>
+                <w:sz w:val="19"/>
+              </w:rPr>
+              <w:t>RD$ 64,600.00</w:t>
+            </w:r>
+          </w:p>
+        </w:tc>
+        <w:tc>
+          <w:tcPr>
+            <w:tcW w:type="dxa" w:w="1361"/>
+          </w:tcPr>
+          <w:p>
+            <w:r/>
+            <w:r>
+              <w:rPr>
+                <w:sz w:val="19"/>
+              </w:rPr>
+              <w:t>10.7%</w:t>
+            </w:r>
+          </w:p>
+        </w:tc>
+      </w:tr>
+      <w:tr>
+        <w:tc>
+          <w:tcPr>
+            <w:tcW w:type="dxa" w:w="2835"/>
+          </w:tcPr>
+          <w:p>
+            <w:r/>
+            <w:r>
+              <w:rPr>
+                <w:sz w:val="19"/>
+              </w:rPr>
+              <w:t>Diseñador UX/UI</w:t>
+            </w:r>
+          </w:p>
+        </w:tc>
+        <w:tc>
+          <w:tcPr>
+            <w:tcW w:type="dxa" w:w="1020"/>
+          </w:tcPr>
+          <w:p>
+            <w:r/>
+            <w:r>
+              <w:rPr>
+                <w:sz w:val="19"/>
+              </w:rPr>
+              <w:t>70</w:t>
+            </w:r>
+          </w:p>
+        </w:tc>
+        <w:tc>
+          <w:tcPr>
+            <w:tcW w:type="dxa" w:w="1814"/>
+          </w:tcPr>
+          <w:p>
+            <w:r/>
+            <w:r>
+              <w:rPr>
+                <w:sz w:val="19"/>
+              </w:rPr>
+              <w:t>RD$ 800.00</w:t>
+            </w:r>
+          </w:p>
+        </w:tc>
+        <w:tc>
+          <w:tcPr>
+            <w:tcW w:type="dxa" w:w="2154"/>
+          </w:tcPr>
+          <w:p>
+            <w:r/>
+            <w:r>
+              <w:rPr>
+                <w:sz w:val="19"/>
+              </w:rPr>
+              <w:t>RD$ 56,000.00</w:t>
+            </w:r>
+          </w:p>
+        </w:tc>
+        <w:tc>
+          <w:tcPr>
+            <w:tcW w:type="dxa" w:w="1361"/>
+          </w:tcPr>
+          <w:p>
+            <w:r/>
+            <w:r>
+              <w:rPr>
+                <w:sz w:val="19"/>
+              </w:rPr>
+              <w:t>9.2%</w:t>
+            </w:r>
+          </w:p>
+        </w:tc>
+      </w:tr>
+      <w:tr>
+        <w:tc>
+          <w:tcPr>
+            <w:tcW w:type="dxa" w:w="2835"/>
+          </w:tcPr>
+          <w:p>
+            <w:r/>
+            <w:r>
+              <w:rPr>
+                <w:sz w:val="19"/>
+              </w:rPr>
+              <w:t>Desarrollador backend (.NET)</w:t>
+            </w:r>
+          </w:p>
+        </w:tc>
+        <w:tc>
+          <w:tcPr>
+            <w:tcW w:type="dxa" w:w="1020"/>
+          </w:tcPr>
+          <w:p>
+            <w:r/>
+            <w:r>
+              <w:rPr>
+                <w:sz w:val="19"/>
+              </w:rPr>
+              <w:t>222</w:t>
+            </w:r>
+          </w:p>
+        </w:tc>
+        <w:tc>
+          <w:tcPr>
+            <w:tcW w:type="dxa" w:w="1814"/>
+          </w:tcPr>
+          <w:p>
+            <w:r/>
+            <w:r>
+              <w:rPr>
+                <w:sz w:val="19"/>
+              </w:rPr>
+              <w:t>RD$ 950.00</w:t>
+            </w:r>
+          </w:p>
+        </w:tc>
+        <w:tc>
+          <w:tcPr>
+            <w:tcW w:type="dxa" w:w="2154"/>
+          </w:tcPr>
+          <w:p>
+            <w:r/>
+            <w:r>
+              <w:rPr>
+                <w:sz w:val="19"/>
+              </w:rPr>
+              <w:t>RD$ 210,900.00</w:t>
+            </w:r>
+          </w:p>
+        </w:tc>
+        <w:tc>
+          <w:tcPr>
+            <w:tcW w:type="dxa" w:w="1361"/>
+          </w:tcPr>
+          <w:p>
+            <w:r/>
+            <w:r>
+              <w:rPr>
+                <w:sz w:val="19"/>
+              </w:rPr>
+              <w:t>34.8%</w:t>
+            </w:r>
+          </w:p>
+        </w:tc>
+      </w:tr>
+      <w:tr>
+        <w:tc>
+          <w:tcPr>
+            <w:tcW w:type="dxa" w:w="2835"/>
+          </w:tcPr>
+          <w:p>
+            <w:r/>
+            <w:r>
+              <w:rPr>
+                <w:sz w:val="19"/>
+              </w:rPr>
+              <w:t>Desarrollador frontend (Vue)</w:t>
+            </w:r>
+          </w:p>
+        </w:tc>
+        <w:tc>
+          <w:tcPr>
+            <w:tcW w:type="dxa" w:w="1020"/>
+          </w:tcPr>
+          <w:p>
+            <w:r/>
+            <w:r>
+              <w:rPr>
+                <w:sz w:val="19"/>
+              </w:rPr>
+              <w:t>160</w:t>
+            </w:r>
+          </w:p>
+        </w:tc>
+        <w:tc>
+          <w:tcPr>
+            <w:tcW w:type="dxa" w:w="1814"/>
+          </w:tcPr>
+          <w:p>
+            <w:r/>
+            <w:r>
+              <w:rPr>
+                <w:sz w:val="19"/>
+              </w:rPr>
+              <w:t>RD$ 850.00</w:t>
+            </w:r>
+          </w:p>
+        </w:tc>
+        <w:tc>
+          <w:tcPr>
+            <w:tcW w:type="dxa" w:w="2154"/>
+          </w:tcPr>
+          <w:p>
+            <w:r/>
+            <w:r>
+              <w:rPr>
+                <w:sz w:val="19"/>
+              </w:rPr>
+              <w:t>RD$ 136,000.00</w:t>
+            </w:r>
+          </w:p>
+        </w:tc>
+        <w:tc>
+          <w:tcPr>
+            <w:tcW w:type="dxa" w:w="1361"/>
+          </w:tcPr>
+          <w:p>
+            <w:r/>
+            <w:r>
+              <w:rPr>
+                <w:sz w:val="19"/>
+              </w:rPr>
+              <w:t>22.4%</w:t>
+            </w:r>
+          </w:p>
+        </w:tc>
+      </w:tr>
+      <w:tr>
+        <w:tc>
+          <w:tcPr>
+            <w:tcW w:type="dxa" w:w="2835"/>
+          </w:tcPr>
+          <w:p>
+            <w:r/>
+            <w:r>
+              <w:rPr>
+                <w:sz w:val="19"/>
+              </w:rPr>
+              <w:t>Tester / QA</w:t>
+            </w:r>
+          </w:p>
+        </w:tc>
+        <w:tc>
+          <w:tcPr>
+            <w:tcW w:type="dxa" w:w="1020"/>
+          </w:tcPr>
+          <w:p>
+            <w:r/>
+            <w:r>
+              <w:rPr>
+                <w:sz w:val="19"/>
+              </w:rPr>
+              <w:t>70</w:t>
+            </w:r>
+          </w:p>
+        </w:tc>
+        <w:tc>
+          <w:tcPr>
+            <w:tcW w:type="dxa" w:w="1814"/>
+          </w:tcPr>
+          <w:p>
+            <w:r/>
+            <w:r>
+              <w:rPr>
+                <w:sz w:val="19"/>
+              </w:rPr>
+              <w:t>RD$ 700.00</w:t>
+            </w:r>
+          </w:p>
+        </w:tc>
+        <w:tc>
+          <w:tcPr>
+            <w:tcW w:type="dxa" w:w="2154"/>
+          </w:tcPr>
+          <w:p>
+            <w:r/>
+            <w:r>
+              <w:rPr>
+                <w:sz w:val="19"/>
+              </w:rPr>
+              <w:t>RD$ 49,000.00</w:t>
+            </w:r>
+          </w:p>
+        </w:tc>
+        <w:tc>
+          <w:tcPr>
+            <w:tcW w:type="dxa" w:w="1361"/>
+          </w:tcPr>
+          <w:p>
+            <w:r/>
+            <w:r>
+              <w:rPr>
+                <w:sz w:val="19"/>
+              </w:rPr>
+              <w:t>8.1%</w:t>
+            </w:r>
+          </w:p>
+        </w:tc>
+      </w:tr>
+      <w:tr>
+        <w:tc>
+          <w:tcPr>
+            <w:tcW w:type="dxa" w:w="2835"/>
+          </w:tcPr>
+          <w:p>
+            <w:r/>
+            <w:r>
+              <w:rPr>
+                <w:sz w:val="19"/>
+              </w:rPr>
+              <w:t>DevOps</w:t>
+            </w:r>
+          </w:p>
+        </w:tc>
+        <w:tc>
+          <w:tcPr>
+            <w:tcW w:type="dxa" w:w="1020"/>
+          </w:tcPr>
+          <w:p>
+            <w:r/>
+            <w:r>
+              <w:rPr>
+                <w:sz w:val="19"/>
+              </w:rPr>
+              <w:t>24</w:t>
+            </w:r>
+          </w:p>
+        </w:tc>
+        <w:tc>
+          <w:tcPr>
+            <w:tcW w:type="dxa" w:w="1814"/>
+          </w:tcPr>
+          <w:p>
+            <w:r/>
+            <w:r>
+              <w:rPr>
+                <w:sz w:val="19"/>
+              </w:rPr>
+              <w:t>RD$ 1,000.00</w:t>
+            </w:r>
+          </w:p>
+        </w:tc>
+        <w:tc>
+          <w:tcPr>
+            <w:tcW w:type="dxa" w:w="2154"/>
+          </w:tcPr>
+          <w:p>
+            <w:r/>
+            <w:r>
+              <w:rPr>
+                <w:sz w:val="19"/>
+              </w:rPr>
+              <w:t>RD$ 24,000.00</w:t>
+            </w:r>
+          </w:p>
+        </w:tc>
+        <w:tc>
+          <w:tcPr>
+            <w:tcW w:type="dxa" w:w="1361"/>
+          </w:tcPr>
+          <w:p>
+            <w:r/>
+            <w:r>
+              <w:rPr>
+                <w:sz w:val="19"/>
+              </w:rPr>
+              <w:t>4.0%</w:t>
+            </w:r>
+          </w:p>
+        </w:tc>
+      </w:tr>
+      <w:tr>
+        <w:tc>
+          <w:tcPr>
+            <w:tcW w:type="dxa" w:w="2835"/>
+          </w:tcPr>
+          <w:p>
+            <w:r/>
+            <w:r>
+              <w:rPr>
+                <w:sz w:val="19"/>
+              </w:rPr>
+              <w:t>Total</w:t>
+            </w:r>
+          </w:p>
+        </w:tc>
+        <w:tc>
+          <w:tcPr>
+            <w:tcW w:type="dxa" w:w="1020"/>
+          </w:tcPr>
+          <w:p>
+            <w:r/>
+            <w:r>
+              <w:rPr>
+                <w:sz w:val="19"/>
+              </w:rPr>
+              <w:t>682</w:t>
+            </w:r>
+          </w:p>
+        </w:tc>
+        <w:tc>
+          <w:tcPr>
+            <w:tcW w:type="dxa" w:w="1814"/>
+          </w:tcPr>
+          <w:p>
+            <w:r/>
+            <w:r>
+              <w:rPr>
+                <w:sz w:val="19"/>
+              </w:rPr>
+            </w:r>
+          </w:p>
+        </w:tc>
+        <w:tc>
+          <w:tcPr>
+            <w:tcW w:type="dxa" w:w="2154"/>
+          </w:tcPr>
+          <w:p>
+            <w:r/>
+            <w:r>
+              <w:rPr>
+                <w:sz w:val="19"/>
+              </w:rPr>
+              <w:t>RD$ 606,500.00</w:t>
+            </w:r>
+          </w:p>
+        </w:tc>
+        <w:tc>
+          <w:tcPr>
+            <w:tcW w:type="dxa" w:w="1361"/>
+          </w:tcPr>
+          <w:p>
+            <w:r/>
+            <w:r>
+              <w:rPr>
+                <w:sz w:val="19"/>
+              </w:rPr>
+              <w:t>100%</w:t>
+            </w:r>
+          </w:p>
+        </w:tc>
+      </w:tr>
+    </w:tbl>
+    <w:p/>
+    <w:p>
+      <w:pPr>
+        <w:pStyle w:val="Heading2"/>
+      </w:pPr>
+      <w:r>
+        <w:t>9.4 Otros costos</w:t>
+      </w:r>
+    </w:p>
+    <w:p>
+      <w:r>
+        <w:t>Las herramientas de desarrollo son gratuitas: .NET, Visual Studio Code, Node, Vue, Docker Desktop (uso personal y educativo), draw.io, Figma (plan gratuito), GitHub y GitHub Actions para repositorios públicos. Los costos de operar el sistema durante el primer año son:</w:t>
+      </w:r>
+    </w:p>
+    <w:tbl>
+      <w:tblPr>
+        <w:tblStyle w:val="TableGrid"/>
+        <w:tblW w:type="auto" w:w="0"/>
+        <w:jc w:val="center"/>
+        <w:tblLayout w:type="fixed"/>
+        <w:tblLook w:firstColumn="1" w:firstRow="1" w:lastColumn="0" w:lastRow="0" w:noHBand="0" w:noVBand="1" w:val="04A0"/>
+      </w:tblPr>
+      <w:tblGrid>
+        <w:gridCol w:w="3249"/>
+        <w:gridCol w:w="3249"/>
+        <w:gridCol w:w="3249"/>
+      </w:tblGrid>
+      <w:tr>
+        <w:trPr>
+          <w:tblHeader w:val="true"/>
+        </w:trPr>
+        <w:tc>
+          <w:tcPr>
+            <w:tcW w:type="dxa" w:w="3969"/>
+            <w:shd w:val="clear" w:color="auto" w:fill="0D4C92"/>
+          </w:tcPr>
+          <w:p>
+            <w:r/>
+            <w:r>
+              <w:rPr>
+                <w:b/>
+                <w:color w:val="FFFFFF"/>
+                <w:sz w:val="20"/>
+              </w:rPr>
+              <w:t>Concepto</w:t>
+            </w:r>
+          </w:p>
+        </w:tc>
+        <w:tc>
+          <w:tcPr>
+            <w:tcW w:type="dxa" w:w="2948"/>
+            <w:shd w:val="clear" w:color="auto" w:fill="0D4C92"/>
+          </w:tcPr>
+          <w:p>
+            <w:r/>
+            <w:r>
+              <w:rPr>
+                <w:b/>
+                <w:color w:val="FFFFFF"/>
+                <w:sz w:val="20"/>
+              </w:rPr>
+              <w:t>Detalle</w:t>
+            </w:r>
+          </w:p>
+        </w:tc>
+        <w:tc>
+          <w:tcPr>
+            <w:tcW w:type="dxa" w:w="2835"/>
+            <w:shd w:val="clear" w:color="auto" w:fill="0D4C92"/>
+          </w:tcPr>
+          <w:p>
+            <w:r/>
+            <w:r>
+              <w:rPr>
+                <w:b/>
+                <w:color w:val="FFFFFF"/>
+                <w:sz w:val="20"/>
+              </w:rPr>
+              <w:t>Costo</w:t>
+            </w:r>
+          </w:p>
+        </w:tc>
+      </w:tr>
+      <w:tr>
+        <w:tc>
+          <w:tcPr>
+            <w:tcW w:type="dxa" w:w="3969"/>
+          </w:tcPr>
+          <w:p>
+            <w:r/>
+            <w:r>
+              <w:rPr>
+                <w:sz w:val="19"/>
+              </w:rPr>
+              <w:t>Servidor virtual (VPS) 2 vCPU, 4 GB RAM</w:t>
+            </w:r>
+          </w:p>
+        </w:tc>
+        <w:tc>
+          <w:tcPr>
+            <w:tcW w:type="dxa" w:w="2948"/>
+          </w:tcPr>
+          <w:p>
+            <w:r/>
+            <w:r>
+              <w:rPr>
+                <w:sz w:val="19"/>
+              </w:rPr>
+              <w:t>12 meses × US$ 24</w:t>
+            </w:r>
+          </w:p>
+        </w:tc>
+        <w:tc>
+          <w:tcPr>
+            <w:tcW w:type="dxa" w:w="2835"/>
+          </w:tcPr>
+          <w:p>
+            <w:r/>
+            <w:r>
+              <w:rPr>
+                <w:sz w:val="19"/>
+              </w:rPr>
+              <w:t>RD$ 18,144.00</w:t>
+            </w:r>
+          </w:p>
+        </w:tc>
+      </w:tr>
+      <w:tr>
+        <w:tc>
+          <w:tcPr>
+            <w:tcW w:type="dxa" w:w="3969"/>
+          </w:tcPr>
+          <w:p>
+            <w:r/>
+            <w:r>
+              <w:rPr>
+                <w:sz w:val="19"/>
+              </w:rPr>
+              <w:t>Dominio .com.do</w:t>
+            </w:r>
+          </w:p>
+        </w:tc>
+        <w:tc>
+          <w:tcPr>
+            <w:tcW w:type="dxa" w:w="2948"/>
+          </w:tcPr>
+          <w:p>
+            <w:r/>
+            <w:r>
+              <w:rPr>
+                <w:sz w:val="19"/>
+              </w:rPr>
+              <w:t>1 año</w:t>
+            </w:r>
+          </w:p>
+        </w:tc>
+        <w:tc>
+          <w:tcPr>
+            <w:tcW w:type="dxa" w:w="2835"/>
+          </w:tcPr>
+          <w:p>
+            <w:r/>
+            <w:r>
+              <w:rPr>
+                <w:sz w:val="19"/>
+              </w:rPr>
+              <w:t>RD$ 2,500.00</w:t>
+            </w:r>
+          </w:p>
+        </w:tc>
+      </w:tr>
+      <w:tr>
+        <w:tc>
+          <w:tcPr>
+            <w:tcW w:type="dxa" w:w="3969"/>
+          </w:tcPr>
+          <w:p>
+            <w:r/>
+            <w:r>
+              <w:rPr>
+                <w:sz w:val="19"/>
+              </w:rPr>
+              <w:t>Certificado HTTPS (Let's Encrypt)</w:t>
+            </w:r>
+          </w:p>
+        </w:tc>
+        <w:tc>
+          <w:tcPr>
+            <w:tcW w:type="dxa" w:w="2948"/>
+          </w:tcPr>
+          <w:p>
+            <w:r/>
+            <w:r>
+              <w:rPr>
+                <w:sz w:val="19"/>
+              </w:rPr>
+              <w:t>Gratis</w:t>
+            </w:r>
+          </w:p>
+        </w:tc>
+        <w:tc>
+          <w:tcPr>
+            <w:tcW w:type="dxa" w:w="2835"/>
+          </w:tcPr>
+          <w:p>
+            <w:r/>
+            <w:r>
+              <w:rPr>
+                <w:sz w:val="19"/>
+              </w:rPr>
+              <w:t>RD$ 0.00</w:t>
+            </w:r>
+          </w:p>
+        </w:tc>
+      </w:tr>
+      <w:tr>
+        <w:tc>
+          <w:tcPr>
+            <w:tcW w:type="dxa" w:w="3969"/>
+          </w:tcPr>
+          <w:p>
+            <w:r/>
+            <w:r>
+              <w:rPr>
+                <w:sz w:val="19"/>
+              </w:rPr>
+              <w:t>Servicio de correo SMTP transaccional</w:t>
+            </w:r>
+          </w:p>
+        </w:tc>
+        <w:tc>
+          <w:tcPr>
+            <w:tcW w:type="dxa" w:w="2948"/>
+          </w:tcPr>
+          <w:p>
+            <w:r/>
+            <w:r>
+              <w:rPr>
+                <w:sz w:val="19"/>
+              </w:rPr>
+              <w:t>12 meses × US$ 15</w:t>
+            </w:r>
+          </w:p>
+        </w:tc>
+        <w:tc>
+          <w:tcPr>
+            <w:tcW w:type="dxa" w:w="2835"/>
+          </w:tcPr>
+          <w:p>
+            <w:r/>
+            <w:r>
+              <w:rPr>
+                <w:sz w:val="19"/>
+              </w:rPr>
+              <w:t>RD$ 11,340.00</w:t>
+            </w:r>
+          </w:p>
+        </w:tc>
+      </w:tr>
+      <w:tr>
+        <w:tc>
+          <w:tcPr>
+            <w:tcW w:type="dxa" w:w="3969"/>
+          </w:tcPr>
+          <w:p>
+            <w:r/>
+            <w:r>
+              <w:rPr>
+                <w:sz w:val="19"/>
+              </w:rPr>
+              <w:t>Respaldo de base de datos y fotos</w:t>
+            </w:r>
+          </w:p>
+        </w:tc>
+        <w:tc>
+          <w:tcPr>
+            <w:tcW w:type="dxa" w:w="2948"/>
+          </w:tcPr>
+          <w:p>
+            <w:r/>
+            <w:r>
+              <w:rPr>
+                <w:sz w:val="19"/>
+              </w:rPr>
+              <w:t>12 meses × US$ 5</w:t>
+            </w:r>
+          </w:p>
+        </w:tc>
+        <w:tc>
+          <w:tcPr>
+            <w:tcW w:type="dxa" w:w="2835"/>
+          </w:tcPr>
+          <w:p>
+            <w:r/>
+            <w:r>
+              <w:rPr>
+                <w:sz w:val="19"/>
+              </w:rPr>
+              <w:t>RD$ 3,780.00</w:t>
+            </w:r>
+          </w:p>
+        </w:tc>
+      </w:tr>
+      <w:tr>
+        <w:tc>
+          <w:tcPr>
+            <w:tcW w:type="dxa" w:w="3969"/>
+          </w:tcPr>
+          <w:p>
+            <w:r/>
+            <w:r>
+              <w:rPr>
+                <w:sz w:val="19"/>
+              </w:rPr>
+              <w:t>Internet y electricidad del equipo</w:t>
+            </w:r>
+          </w:p>
+        </w:tc>
+        <w:tc>
+          <w:tcPr>
+            <w:tcW w:type="dxa" w:w="2948"/>
+          </w:tcPr>
+          <w:p>
+            <w:r/>
+            <w:r>
+              <w:rPr>
+                <w:sz w:val="19"/>
+              </w:rPr>
+              <w:t>3.5 meses × RD$ 4,500</w:t>
+            </w:r>
+          </w:p>
+        </w:tc>
+        <w:tc>
+          <w:tcPr>
+            <w:tcW w:type="dxa" w:w="2835"/>
+          </w:tcPr>
+          <w:p>
+            <w:r/>
+            <w:r>
+              <w:rPr>
+                <w:sz w:val="19"/>
+              </w:rPr>
+              <w:t>RD$ 15,750.00</w:t>
+            </w:r>
+          </w:p>
+        </w:tc>
+      </w:tr>
+      <w:tr>
+        <w:tc>
+          <w:tcPr>
+            <w:tcW w:type="dxa" w:w="3969"/>
+          </w:tcPr>
+          <w:p>
+            <w:r/>
+            <w:r>
+              <w:rPr>
+                <w:sz w:val="19"/>
+              </w:rPr>
+              <w:t>Total otros costos</w:t>
+            </w:r>
+          </w:p>
+        </w:tc>
+        <w:tc>
+          <w:tcPr>
+            <w:tcW w:type="dxa" w:w="2948"/>
+          </w:tcPr>
+          <w:p>
+            <w:r/>
+            <w:r>
+              <w:rPr>
+                <w:sz w:val="19"/>
+              </w:rPr>
+            </w:r>
+          </w:p>
+        </w:tc>
+        <w:tc>
+          <w:tcPr>
+            <w:tcW w:type="dxa" w:w="2835"/>
+          </w:tcPr>
+          <w:p>
+            <w:r/>
+            <w:r>
+              <w:rPr>
+                <w:sz w:val="19"/>
+              </w:rPr>
+              <w:t>RD$ 51,514.00</w:t>
+            </w:r>
+          </w:p>
+        </w:tc>
+      </w:tr>
+    </w:tbl>
+    <w:p/>
+    <w:p>
+      <w:pPr>
+        <w:pStyle w:val="Heading2"/>
+      </w:pPr>
+      <w:r>
+        <w:t>9.5 Presupuesto total</w:t>
+      </w:r>
+    </w:p>
+    <w:tbl>
+      <w:tblPr>
+        <w:tblStyle w:val="TableGrid"/>
+        <w:tblW w:type="auto" w:w="0"/>
+        <w:jc w:val="center"/>
+        <w:tblLayout w:type="fixed"/>
+        <w:tblLook w:firstColumn="1" w:firstRow="1" w:lastColumn="0" w:lastRow="0" w:noHBand="0" w:noVBand="1" w:val="04A0"/>
+      </w:tblPr>
+      <w:tblGrid>
+        <w:gridCol w:w="3249"/>
+        <w:gridCol w:w="3249"/>
+        <w:gridCol w:w="3249"/>
+      </w:tblGrid>
+      <w:tr>
+        <w:trPr>
+          <w:tblHeader w:val="true"/>
+        </w:trPr>
+        <w:tc>
+          <w:tcPr>
+            <w:tcW w:type="dxa" w:w="4082"/>
+            <w:shd w:val="clear" w:color="auto" w:fill="0D4C92"/>
+          </w:tcPr>
+          <w:p>
+            <w:r/>
+            <w:r>
+              <w:rPr>
+                <w:b/>
+                <w:color w:val="FFFFFF"/>
+                <w:sz w:val="20"/>
+              </w:rPr>
+              <w:t>Concepto</w:t>
+            </w:r>
+          </w:p>
+        </w:tc>
+        <w:tc>
+          <w:tcPr>
+            <w:tcW w:type="dxa" w:w="2835"/>
+            <w:shd w:val="clear" w:color="auto" w:fill="0D4C92"/>
+          </w:tcPr>
+          <w:p>
+            <w:r/>
+            <w:r>
+              <w:rPr>
+                <w:b/>
+                <w:color w:val="FFFFFF"/>
+                <w:sz w:val="20"/>
+              </w:rPr>
+              <w:t>RD$</w:t>
+            </w:r>
+          </w:p>
+        </w:tc>
+        <w:tc>
+          <w:tcPr>
+            <w:tcW w:type="dxa" w:w="2835"/>
+            <w:shd w:val="clear" w:color="auto" w:fill="0D4C92"/>
+          </w:tcPr>
+          <w:p>
+            <w:r/>
+            <w:r>
+              <w:rPr>
+                <w:b/>
+                <w:color w:val="FFFFFF"/>
+                <w:sz w:val="20"/>
+              </w:rPr>
+              <w:t>US$</w:t>
+            </w:r>
+          </w:p>
+        </w:tc>
+      </w:tr>
+      <w:tr>
+        <w:tc>
+          <w:tcPr>
+            <w:tcW w:type="dxa" w:w="4082"/>
+          </w:tcPr>
+          <w:p>
+            <w:r/>
+            <w:r>
+              <w:rPr>
+                <w:sz w:val="19"/>
+              </w:rPr>
+              <w:t>Mano de obra</w:t>
+            </w:r>
+          </w:p>
+        </w:tc>
+        <w:tc>
+          <w:tcPr>
+            <w:tcW w:type="dxa" w:w="2835"/>
+          </w:tcPr>
+          <w:p>
+            <w:r/>
+            <w:r>
+              <w:rPr>
+                <w:sz w:val="19"/>
+              </w:rPr>
+              <w:t>RD$ 606,500.00</w:t>
+            </w:r>
+          </w:p>
+        </w:tc>
+        <w:tc>
+          <w:tcPr>
+            <w:tcW w:type="dxa" w:w="2835"/>
+          </w:tcPr>
+          <w:p>
+            <w:r/>
+            <w:r>
+              <w:rPr>
+                <w:sz w:val="19"/>
+              </w:rPr>
+              <w:t>US$ 9,626.98</w:t>
+            </w:r>
+          </w:p>
+        </w:tc>
+      </w:tr>
+      <w:tr>
+        <w:tc>
+          <w:tcPr>
+            <w:tcW w:type="dxa" w:w="4082"/>
+          </w:tcPr>
+          <w:p>
+            <w:r/>
+            <w:r>
+              <w:rPr>
+                <w:sz w:val="19"/>
+              </w:rPr>
+              <w:t>Otros costos (primer año)</w:t>
+            </w:r>
+          </w:p>
+        </w:tc>
+        <w:tc>
+          <w:tcPr>
+            <w:tcW w:type="dxa" w:w="2835"/>
+          </w:tcPr>
+          <w:p>
+            <w:r/>
+            <w:r>
+              <w:rPr>
+                <w:sz w:val="19"/>
+              </w:rPr>
+              <w:t>RD$ 51,514.00</w:t>
+            </w:r>
+          </w:p>
+        </w:tc>
+        <w:tc>
+          <w:tcPr>
+            <w:tcW w:type="dxa" w:w="2835"/>
+          </w:tcPr>
+          <w:p>
+            <w:r/>
+            <w:r>
+              <w:rPr>
+                <w:sz w:val="19"/>
+              </w:rPr>
+              <w:t>US$ 817.68</w:t>
+            </w:r>
+          </w:p>
+        </w:tc>
+      </w:tr>
+      <w:tr>
+        <w:tc>
+          <w:tcPr>
+            <w:tcW w:type="dxa" w:w="4082"/>
+          </w:tcPr>
+          <w:p>
+            <w:r/>
+            <w:r>
+              <w:rPr>
+                <w:sz w:val="19"/>
+              </w:rPr>
+              <w:t>Contingencia (10 %)</w:t>
+            </w:r>
+          </w:p>
+        </w:tc>
+        <w:tc>
+          <w:tcPr>
+            <w:tcW w:type="dxa" w:w="2835"/>
+          </w:tcPr>
+          <w:p>
+            <w:r/>
+            <w:r>
+              <w:rPr>
+                <w:sz w:val="19"/>
+              </w:rPr>
+              <w:t>RD$ 65,801.40</w:t>
+            </w:r>
+          </w:p>
+        </w:tc>
+        <w:tc>
+          <w:tcPr>
+            <w:tcW w:type="dxa" w:w="2835"/>
+          </w:tcPr>
+          <w:p>
+            <w:r/>
+            <w:r>
+              <w:rPr>
+                <w:sz w:val="19"/>
+              </w:rPr>
+              <w:t>US$ 1,044.47</w:t>
+            </w:r>
+          </w:p>
+        </w:tc>
+      </w:tr>
+      <w:tr>
+        <w:tc>
+          <w:tcPr>
+            <w:tcW w:type="dxa" w:w="4082"/>
+          </w:tcPr>
+          <w:p>
+            <w:r/>
+            <w:r>
+              <w:rPr>
+                <w:sz w:val="19"/>
+              </w:rPr>
+              <w:t>Subtotal</w:t>
+            </w:r>
+          </w:p>
+        </w:tc>
+        <w:tc>
+          <w:tcPr>
+            <w:tcW w:type="dxa" w:w="2835"/>
+          </w:tcPr>
+          <w:p>
+            <w:r/>
+            <w:r>
+              <w:rPr>
+                <w:sz w:val="19"/>
+              </w:rPr>
+              <w:t>RD$ 723,815.40</w:t>
+            </w:r>
+          </w:p>
+        </w:tc>
+        <w:tc>
+          <w:tcPr>
+            <w:tcW w:type="dxa" w:w="2835"/>
+          </w:tcPr>
+          <w:p>
+            <w:r/>
+            <w:r>
+              <w:rPr>
+                <w:sz w:val="19"/>
+              </w:rPr>
+              <w:t>US$ 11,489.13</w:t>
+            </w:r>
+          </w:p>
+        </w:tc>
+      </w:tr>
+      <w:tr>
+        <w:tc>
+          <w:tcPr>
+            <w:tcW w:type="dxa" w:w="4082"/>
+          </w:tcPr>
+          <w:p>
+            <w:r/>
+            <w:r>
+              <w:rPr>
+                <w:sz w:val="19"/>
+              </w:rPr>
+              <w:t>ITBIS (18 %)</w:t>
+            </w:r>
+          </w:p>
+        </w:tc>
+        <w:tc>
+          <w:tcPr>
+            <w:tcW w:type="dxa" w:w="2835"/>
+          </w:tcPr>
+          <w:p>
+            <w:r/>
+            <w:r>
+              <w:rPr>
+                <w:sz w:val="19"/>
+              </w:rPr>
+              <w:t>RD$ 130,286.77</w:t>
+            </w:r>
+          </w:p>
+        </w:tc>
+        <w:tc>
+          <w:tcPr>
+            <w:tcW w:type="dxa" w:w="2835"/>
+          </w:tcPr>
+          <w:p>
+            <w:r/>
+            <w:r>
+              <w:rPr>
+                <w:sz w:val="19"/>
+              </w:rPr>
+              <w:t>US$ 2,068.04</w:t>
+            </w:r>
+          </w:p>
+        </w:tc>
+      </w:tr>
+      <w:tr>
+        <w:tc>
+          <w:tcPr>
+            <w:tcW w:type="dxa" w:w="4082"/>
+            <w:shd w:val="clear" w:color="auto" w:fill="DCE6F2"/>
+          </w:tcPr>
+          <w:p>
+            <w:r>
+              <w:rPr>
+                <w:b/>
+              </w:rPr>
+            </w:r>
+            <w:r>
+              <w:rPr>
+                <w:sz w:val="19"/>
+              </w:rPr>
+              <w:t>TOTAL DEL PROYECTO</w:t>
+            </w:r>
+          </w:p>
+        </w:tc>
+        <w:tc>
+          <w:tcPr>
+            <w:tcW w:type="dxa" w:w="2835"/>
+            <w:shd w:val="clear" w:color="auto" w:fill="DCE6F2"/>
+          </w:tcPr>
+          <w:p>
+            <w:r>
+              <w:rPr>
+                <w:b/>
+              </w:rPr>
+            </w:r>
+            <w:r>
+              <w:rPr>
+                <w:sz w:val="19"/>
+              </w:rPr>
+              <w:t>RD$ 854,102.17</w:t>
+            </w:r>
+          </w:p>
+        </w:tc>
+        <w:tc>
+          <w:tcPr>
+            <w:tcW w:type="dxa" w:w="2835"/>
+            <w:shd w:val="clear" w:color="auto" w:fill="DCE6F2"/>
+          </w:tcPr>
+          <w:p>
+            <w:r>
+              <w:rPr>
+                <w:b/>
+              </w:rPr>
+            </w:r>
+            <w:r>
+              <w:rPr>
+                <w:sz w:val="19"/>
+              </w:rPr>
+              <w:t>US$ 13,557.18</w:t>
+            </w:r>
+          </w:p>
+        </w:tc>
+      </w:tr>
+    </w:tbl>
+    <w:p/>
+    <w:p>
+      <w:r>
+        <w:t>Tasa de referencia: RD$ 63.00 por US$ 1. La contingencia cubre cambios de alcance y defectos imprevistos. El ITBIS aplica si el trabajo se factura como servicio.</w:t>
+      </w:r>
+    </w:p>
+    <w:p>
+      <w:pPr>
+        <w:pStyle w:val="Heading2"/>
+      </w:pPr>
+      <w:r>
+        <w:t>9.6 Cronograma</w:t>
+      </w:r>
+    </w:p>
+    <w:tbl>
+      <w:tblPr>
+        <w:tblStyle w:val="TableGrid"/>
+        <w:tblW w:type="auto" w:w="0"/>
+        <w:jc w:val="center"/>
+        <w:tblLayout w:type="fixed"/>
+        <w:tblLook w:firstColumn="1" w:firstRow="1" w:lastColumn="0" w:lastRow="0" w:noHBand="0" w:noVBand="1" w:val="04A0"/>
+      </w:tblPr>
+      <w:tblGrid>
+        <w:gridCol w:w="2436"/>
+        <w:gridCol w:w="2436"/>
+        <w:gridCol w:w="2436"/>
+        <w:gridCol w:w="2436"/>
+      </w:tblGrid>
+      <w:tr>
+        <w:trPr>
+          <w:tblHeader w:val="true"/>
+        </w:trPr>
+        <w:tc>
+          <w:tcPr>
+            <w:tcW w:type="dxa" w:w="3175"/>
+            <w:shd w:val="clear" w:color="auto" w:fill="0D4C92"/>
+          </w:tcPr>
+          <w:p>
+            <w:r/>
+            <w:r>
+              <w:rPr>
+                <w:b/>
+                <w:color w:val="FFFFFF"/>
+                <w:sz w:val="20"/>
+              </w:rPr>
+              <w:t>Fase</w:t>
+            </w:r>
+          </w:p>
+        </w:tc>
+        <w:tc>
+          <w:tcPr>
+            <w:tcW w:type="dxa" w:w="2268"/>
+            <w:shd w:val="clear" w:color="auto" w:fill="0D4C92"/>
+          </w:tcPr>
+          <w:p>
+            <w:r/>
+            <w:r>
+              <w:rPr>
+                <w:b/>
+                <w:color w:val="FFFFFF"/>
+                <w:sz w:val="20"/>
+              </w:rPr>
+              <w:t>Semanas</w:t>
+            </w:r>
+          </w:p>
+        </w:tc>
+        <w:tc>
+          <w:tcPr>
+            <w:tcW w:type="dxa" w:w="2154"/>
+            <w:shd w:val="clear" w:color="auto" w:fill="0D4C92"/>
+          </w:tcPr>
+          <w:p>
+            <w:r/>
+            <w:r>
+              <w:rPr>
+                <w:b/>
+                <w:color w:val="FFFFFF"/>
+                <w:sz w:val="20"/>
+              </w:rPr>
+              <w:t>Duración (semanas)</w:t>
+            </w:r>
+          </w:p>
+        </w:tc>
+        <w:tc>
+          <w:tcPr>
+            <w:tcW w:type="dxa" w:w="2154"/>
+            <w:shd w:val="clear" w:color="auto" w:fill="0D4C92"/>
+          </w:tcPr>
+          <w:p>
+            <w:r/>
+            <w:r>
+              <w:rPr>
+                <w:b/>
+                <w:color w:val="FFFFFF"/>
+                <w:sz w:val="20"/>
+              </w:rPr>
+              <w:t>Horas</w:t>
+            </w:r>
+          </w:p>
+        </w:tc>
+      </w:tr>
+      <w:tr>
+        <w:tc>
+          <w:tcPr>
+            <w:tcW w:type="dxa" w:w="3175"/>
+          </w:tcPr>
+          <w:p>
+            <w:r/>
+            <w:r>
+              <w:rPr>
+                <w:sz w:val="19"/>
+              </w:rPr>
+              <w:t>1. Inicio y planificación</w:t>
+            </w:r>
+          </w:p>
+        </w:tc>
+        <w:tc>
+          <w:tcPr>
+            <w:tcW w:type="dxa" w:w="2268"/>
+          </w:tcPr>
+          <w:p>
+            <w:r/>
+            <w:r>
+              <w:rPr>
+                <w:sz w:val="19"/>
+              </w:rPr>
+              <w:t>Semana 1</w:t>
+            </w:r>
+          </w:p>
+        </w:tc>
+        <w:tc>
+          <w:tcPr>
+            <w:tcW w:type="dxa" w:w="2154"/>
+          </w:tcPr>
+          <w:p>
+            <w:r/>
+            <w:r>
+              <w:rPr>
+                <w:sz w:val="19"/>
+              </w:rPr>
+              <w:t>1</w:t>
+            </w:r>
+          </w:p>
+        </w:tc>
+        <w:tc>
+          <w:tcPr>
+            <w:tcW w:type="dxa" w:w="2154"/>
+          </w:tcPr>
+          <w:p>
+            <w:r/>
+            <w:r>
+              <w:rPr>
+                <w:sz w:val="19"/>
+              </w:rPr>
+              <w:t>24</w:t>
+            </w:r>
+          </w:p>
+        </w:tc>
+      </w:tr>
+      <w:tr>
+        <w:tc>
+          <w:tcPr>
+            <w:tcW w:type="dxa" w:w="3175"/>
+          </w:tcPr>
+          <w:p>
+            <w:r/>
+            <w:r>
+              <w:rPr>
+                <w:sz w:val="19"/>
+              </w:rPr>
+              <w:t>2. Análisis de requerimientos</w:t>
+            </w:r>
+          </w:p>
+        </w:tc>
+        <w:tc>
+          <w:tcPr>
+            <w:tcW w:type="dxa" w:w="2268"/>
+          </w:tcPr>
+          <w:p>
+            <w:r/>
+            <w:r>
+              <w:rPr>
+                <w:sz w:val="19"/>
+              </w:rPr>
+              <w:t>Semana 2 a 3</w:t>
+            </w:r>
+          </w:p>
+        </w:tc>
+        <w:tc>
+          <w:tcPr>
+            <w:tcW w:type="dxa" w:w="2154"/>
+          </w:tcPr>
+          <w:p>
+            <w:r/>
+            <w:r>
+              <w:rPr>
+                <w:sz w:val="19"/>
+              </w:rPr>
+              <w:t>2</w:t>
+            </w:r>
+          </w:p>
+        </w:tc>
+        <w:tc>
+          <w:tcPr>
+            <w:tcW w:type="dxa" w:w="2154"/>
+          </w:tcPr>
+          <w:p>
+            <w:r/>
+            <w:r>
+              <w:rPr>
+                <w:sz w:val="19"/>
+              </w:rPr>
+              <w:t>48</w:t>
+            </w:r>
+          </w:p>
+        </w:tc>
+      </w:tr>
+      <w:tr>
+        <w:tc>
+          <w:tcPr>
+            <w:tcW w:type="dxa" w:w="3175"/>
+          </w:tcPr>
+          <w:p>
+            <w:r/>
+            <w:r>
+              <w:rPr>
+                <w:sz w:val="19"/>
+              </w:rPr>
+              <w:t>3. Diseño</w:t>
+            </w:r>
+          </w:p>
+        </w:tc>
+        <w:tc>
+          <w:tcPr>
+            <w:tcW w:type="dxa" w:w="2268"/>
+          </w:tcPr>
+          <w:p>
+            <w:r/>
+            <w:r>
+              <w:rPr>
+                <w:sz w:val="19"/>
+              </w:rPr>
+              <w:t>Semana 4 a 5</w:t>
+            </w:r>
+          </w:p>
+        </w:tc>
+        <w:tc>
+          <w:tcPr>
+            <w:tcW w:type="dxa" w:w="2154"/>
+          </w:tcPr>
+          <w:p>
+            <w:r/>
+            <w:r>
+              <w:rPr>
+                <w:sz w:val="19"/>
+              </w:rPr>
+              <w:t>2</w:t>
+            </w:r>
+          </w:p>
+        </w:tc>
+        <w:tc>
+          <w:tcPr>
+            <w:tcW w:type="dxa" w:w="2154"/>
+          </w:tcPr>
+          <w:p>
+            <w:r/>
+            <w:r>
+              <w:rPr>
+                <w:sz w:val="19"/>
+              </w:rPr>
+              <w:t>92</w:t>
+            </w:r>
+          </w:p>
+        </w:tc>
+      </w:tr>
+      <w:tr>
+        <w:tc>
+          <w:tcPr>
+            <w:tcW w:type="dxa" w:w="3175"/>
+          </w:tcPr>
+          <w:p>
+            <w:r/>
+            <w:r>
+              <w:rPr>
+                <w:sz w:val="19"/>
+              </w:rPr>
+              <w:t>4. Implementación</w:t>
+            </w:r>
+          </w:p>
+        </w:tc>
+        <w:tc>
+          <w:tcPr>
+            <w:tcW w:type="dxa" w:w="2268"/>
+          </w:tcPr>
+          <w:p>
+            <w:r/>
+            <w:r>
+              <w:rPr>
+                <w:sz w:val="19"/>
+              </w:rPr>
+              <w:t>Semana 6 a 10</w:t>
+            </w:r>
+          </w:p>
+        </w:tc>
+        <w:tc>
+          <w:tcPr>
+            <w:tcW w:type="dxa" w:w="2154"/>
+          </w:tcPr>
+          <w:p>
+            <w:r/>
+            <w:r>
+              <w:rPr>
+                <w:sz w:val="19"/>
+              </w:rPr>
+              <w:t>5</w:t>
+            </w:r>
+          </w:p>
+        </w:tc>
+        <w:tc>
+          <w:tcPr>
+            <w:tcW w:type="dxa" w:w="2154"/>
+          </w:tcPr>
+          <w:p>
+            <w:r/>
+            <w:r>
+              <w:rPr>
+                <w:sz w:val="19"/>
+              </w:rPr>
+              <w:t>330</w:t>
+            </w:r>
+          </w:p>
+        </w:tc>
+      </w:tr>
+      <w:tr>
+        <w:tc>
+          <w:tcPr>
+            <w:tcW w:type="dxa" w:w="3175"/>
+          </w:tcPr>
+          <w:p>
+            <w:r/>
+            <w:r>
+              <w:rPr>
+                <w:sz w:val="19"/>
+              </w:rPr>
+              <w:t>5. Pruebas</w:t>
+            </w:r>
+          </w:p>
+        </w:tc>
+        <w:tc>
+          <w:tcPr>
+            <w:tcW w:type="dxa" w:w="2268"/>
+          </w:tcPr>
+          <w:p>
+            <w:r/>
+            <w:r>
+              <w:rPr>
+                <w:sz w:val="19"/>
+              </w:rPr>
+              <w:t>Semana 11 a 12</w:t>
+            </w:r>
+          </w:p>
+        </w:tc>
+        <w:tc>
+          <w:tcPr>
+            <w:tcW w:type="dxa" w:w="2154"/>
+          </w:tcPr>
+          <w:p>
+            <w:r/>
+            <w:r>
+              <w:rPr>
+                <w:sz w:val="19"/>
+              </w:rPr>
+              <w:t>2</w:t>
+            </w:r>
+          </w:p>
+        </w:tc>
+        <w:tc>
+          <w:tcPr>
+            <w:tcW w:type="dxa" w:w="2154"/>
+          </w:tcPr>
+          <w:p>
+            <w:r/>
+            <w:r>
+              <w:rPr>
+                <w:sz w:val="19"/>
+              </w:rPr>
+              <w:t>100</w:t>
+            </w:r>
+          </w:p>
+        </w:tc>
+      </w:tr>
+      <w:tr>
+        <w:tc>
+          <w:tcPr>
+            <w:tcW w:type="dxa" w:w="3175"/>
+          </w:tcPr>
+          <w:p>
+            <w:r/>
+            <w:r>
+              <w:rPr>
+                <w:sz w:val="19"/>
+              </w:rPr>
+              <w:t>6. Despliegue</w:t>
+            </w:r>
+          </w:p>
+        </w:tc>
+        <w:tc>
+          <w:tcPr>
+            <w:tcW w:type="dxa" w:w="2268"/>
+          </w:tcPr>
+          <w:p>
+            <w:r/>
+            <w:r>
+              <w:rPr>
+                <w:sz w:val="19"/>
+              </w:rPr>
+              <w:t>Semana 13</w:t>
+            </w:r>
+          </w:p>
+        </w:tc>
+        <w:tc>
+          <w:tcPr>
+            <w:tcW w:type="dxa" w:w="2154"/>
+          </w:tcPr>
+          <w:p>
+            <w:r/>
+            <w:r>
+              <w:rPr>
+                <w:sz w:val="19"/>
+              </w:rPr>
+              <w:t>1</w:t>
+            </w:r>
+          </w:p>
+        </w:tc>
+        <w:tc>
+          <w:tcPr>
+            <w:tcW w:type="dxa" w:w="2154"/>
+          </w:tcPr>
+          <w:p>
+            <w:r/>
+            <w:r>
+              <w:rPr>
+                <w:sz w:val="19"/>
+              </w:rPr>
+              <w:t>30</w:t>
+            </w:r>
+          </w:p>
+        </w:tc>
+      </w:tr>
+      <w:tr>
+        <w:tc>
+          <w:tcPr>
+            <w:tcW w:type="dxa" w:w="3175"/>
+          </w:tcPr>
+          <w:p>
+            <w:r/>
+            <w:r>
+              <w:rPr>
+                <w:sz w:val="19"/>
+              </w:rPr>
+              <w:t>7. Mantenimiento y cierre</w:t>
+            </w:r>
+          </w:p>
+        </w:tc>
+        <w:tc>
+          <w:tcPr>
+            <w:tcW w:type="dxa" w:w="2268"/>
+          </w:tcPr>
+          <w:p>
+            <w:r/>
+            <w:r>
+              <w:rPr>
+                <w:sz w:val="19"/>
+              </w:rPr>
+              <w:t>Semana 14</w:t>
+            </w:r>
+          </w:p>
+        </w:tc>
+        <w:tc>
+          <w:tcPr>
+            <w:tcW w:type="dxa" w:w="2154"/>
+          </w:tcPr>
+          <w:p>
+            <w:r/>
+            <w:r>
+              <w:rPr>
+                <w:sz w:val="19"/>
+              </w:rPr>
+              <w:t>1</w:t>
+            </w:r>
+          </w:p>
+        </w:tc>
+        <w:tc>
+          <w:tcPr>
+            <w:tcW w:type="dxa" w:w="2154"/>
+          </w:tcPr>
+          <w:p>
+            <w:r/>
+            <w:r>
+              <w:rPr>
+                <w:sz w:val="19"/>
+              </w:rPr>
+              <w:t>58</w:t>
+            </w:r>
+          </w:p>
+        </w:tc>
+      </w:tr>
+      <w:tr>
+        <w:tc>
+          <w:tcPr>
+            <w:tcW w:type="dxa" w:w="3175"/>
+          </w:tcPr>
+          <w:p>
+            <w:r/>
+            <w:r>
+              <w:rPr>
+                <w:sz w:val="19"/>
+              </w:rPr>
+              <w:t>Total</w:t>
+            </w:r>
+          </w:p>
+        </w:tc>
+        <w:tc>
+          <w:tcPr>
+            <w:tcW w:type="dxa" w:w="2268"/>
+          </w:tcPr>
+          <w:p>
+            <w:r/>
+            <w:r>
+              <w:rPr>
+                <w:sz w:val="19"/>
+              </w:rPr>
+            </w:r>
+          </w:p>
+        </w:tc>
+        <w:tc>
+          <w:tcPr>
+            <w:tcW w:type="dxa" w:w="2154"/>
+          </w:tcPr>
+          <w:p>
+            <w:r/>
+            <w:r>
+              <w:rPr>
+                <w:sz w:val="19"/>
+              </w:rPr>
+              <w:t>14</w:t>
+            </w:r>
+          </w:p>
+        </w:tc>
+        <w:tc>
+          <w:tcPr>
+            <w:tcW w:type="dxa" w:w="2154"/>
+          </w:tcPr>
+          <w:p>
+            <w:r/>
+            <w:r>
+              <w:rPr>
+                <w:sz w:val="19"/>
+              </w:rPr>
+              <w:t>682</w:t>
+            </w:r>
+          </w:p>
+        </w:tc>
+      </w:tr>
+    </w:tbl>
+    <w:p/>
+    <w:p>
+      <w:r>
+        <w:t>Duración total: 14 semanas (unos 3.2 meses). Las fases se solapan en la práctica: las pruebas empiezan durante la implementación, porque cada incremento se prueba antes de integrarse.</w:t>
       </w:r>
     </w:p>
     <w:p>

</xml_diff>